<commit_message>
v34: fix spv2 missing, verify all 26 checks pass
</commit_message>
<xml_diff>
--- a/docs/HLD_Perla_CookingBook.docx
+++ b/docs/HLD_Perla_CookingBook.docx
@@ -25,9 +25,23 @@
       <w:r>
         <w:rPr>
           <w:rFonts w:ascii="David" w:hAnsi="David"/>
-          <w:sz w:val="28"/>
+          <w:sz w:val="24"/>
         </w:rPr>
-        <w:t>לזכרם של פרלה ופנחס בן הראש ז״ל</w:t>
+        <w:t>לזכרם של פרלה ופנחס בן הראש שזכרונם יהיה לברכה וגאווה לדורי דורות</w:t>
+      </w:r>
+    </w:p>
+    <w:p>
+      <w:pPr>
+        <w:jc w:val="right"/>
+        <w:bidi/>
+      </w:pPr>
+      <w:r>
+        <w:rPr>
+          <w:rFonts w:ascii="David" w:hAnsi="David"/>
+          <w:i/>
+          <w:sz w:val="24"/>
+        </w:rPr>
+        <w:t>דרך הטעם המעלה זכרונות שחשבנו שכבר שכחנו...</w:t>
       </w:r>
     </w:p>
     <w:p>
@@ -101,7 +115,115 @@
         <w:rPr>
           <w:rFonts w:ascii="David" w:hAnsi="David"/>
         </w:rPr>
-        <w:t>ספר הבישול של משפחת בן הראש הוא אתר ווב סטטי המתעד 1,054 מתכונים אותנטיים מהמטבח המרוקאי, הספרדי-יהודי, ומטבחי יהדות המזרח — כולל 40 מתכונים לא כשרים בקטגוריה ייעודית. האתר נבנה כמסמך דיגיטלי חי, המשמר מורשת קולינרית של יהדות קזבלנקה ומרקש, תוך שילוב השפעות ספרדיות ממשפחת קארו — צאצאי מגורשי ספרד 1492.</w:t>
+        <w:t>ספר הבישול של משפחת בן הראש הוא אתר ווב סטטי המתעד 1,054 מתכונים אותנטיים מהמטבח המרוקאי, הספרדי-יהודי, ומטבחי יהדות המזרח — כולל 40 מתכונים לא כשרים בקטגוריה ייעודית. האתר נבנה כמסמך דיגיטלי חי, המשמר מורשת קולינרית של יהדות קזבלנקה ומרקש, תוך שילוב השפעות ספרדיות ממשפחת קארו — צאצאי מגורשי ספרד 1492 — ומתכונים שנלמדו מהשכנים והחברים שעטפו את המשפחה באהבה בשכונת הקטמון בירושלים.</w:t>
+      </w:r>
+    </w:p>
+    <w:p>
+      <w:pPr>
+        <w:jc w:val="right"/>
+        <w:bidi/>
+      </w:pPr>
+      <w:r>
+        <w:rPr>
+          <w:rFonts w:ascii="David" w:hAnsi="David"/>
+        </w:rPr>
+      </w:r>
+    </w:p>
+    <w:p>
+      <w:pPr>
+        <w:jc w:val="right"/>
+        <w:bidi/>
+      </w:pPr>
+      <w:r>
+        <w:rPr>
+          <w:rFonts w:ascii="David" w:hAnsi="David"/>
+          <w:b/>
+        </w:rPr>
+        <w:t>מטרות עיקריות:</w:t>
+      </w:r>
+    </w:p>
+    <w:p>
+      <w:pPr>
+        <w:jc w:val="right"/>
+        <w:bidi/>
+      </w:pPr>
+      <w:r>
+        <w:rPr>
+          <w:rFonts w:ascii="David" w:hAnsi="David"/>
+        </w:rPr>
+        <w:t>שימור מורשת קולינרית לדורות הבאים — מניעת אובדן מתכונים מסורתיים</w:t>
+      </w:r>
+    </w:p>
+    <w:p>
+      <w:pPr>
+        <w:jc w:val="right"/>
+        <w:bidi/>
+      </w:pPr>
+      <w:r>
+        <w:rPr>
+          <w:rFonts w:ascii="David" w:hAnsi="David"/>
+        </w:rPr>
+        <w:t>שמירת כשרות — הפרדה ברורה בין מתכונים כשרים ולא כשרים, עם תחליפי פרווה</w:t>
+      </w:r>
+    </w:p>
+    <w:p>
+      <w:pPr>
+        <w:jc w:val="right"/>
+        <w:bidi/>
+      </w:pPr>
+      <w:r>
+        <w:rPr>
+          <w:rFonts w:ascii="David" w:hAnsi="David"/>
+        </w:rPr>
+        <w:t>נגישות — כל אחד יכול לבשל, גם מי שמעולם לא בישל</w:t>
+      </w:r>
+    </w:p>
+    <w:p>
+      <w:pPr>
+        <w:jc w:val="right"/>
+        <w:bidi/>
+      </w:pPr>
+      <w:r>
+        <w:rPr>
+          <w:rFonts w:ascii="David" w:hAnsi="David"/>
+        </w:rPr>
+        <w:t>ריספונסיביות מלאה — עובד על טלפון, טאבלט ומחשב</w:t>
+      </w:r>
+    </w:p>
+    <w:p>
+      <w:pPr>
+        <w:jc w:val="right"/>
+        <w:bidi/>
+      </w:pPr>
+      <w:r>
+        <w:rPr>
+          <w:rFonts w:ascii="David" w:hAnsi="David"/>
+        </w:rPr>
+        <w:t>ביצועים — אפס תלות בשרת חיצוני, multi-file SPA</w:t>
+      </w:r>
+    </w:p>
+    <w:p>
+      <w:pPr>
+        <w:jc w:val="right"/>
+        <w:bidi/>
+      </w:pPr>
+      <w:r>
+        <w:rPr>
+          <w:rFonts w:ascii="David" w:hAnsi="David"/>
+        </w:rPr>
+        <w:t>ניווט אינטואיטיבי — תפריט dropdown רב-רמתי עם 19 קטגוריות</w:t>
+      </w:r>
+    </w:p>
+    <w:p>
+      <w:pPr>
+        <w:jc w:val="right"/>
+        <w:bidi/>
+      </w:pPr>
+      <w:r>
+        <w:rPr>
+          <w:rFonts w:ascii="David" w:hAnsi="David"/>
+        </w:rPr>
+        <w:t>דו-לשוניות — עברית ואנגלית מלאה עם 3 שכבות תרגום</w:t>
       </w:r>
     </w:p>
     <w:p>
@@ -117,6 +239,19 @@
         <w:t>2. סקירת הפתרון הטכני</w:t>
       </w:r>
     </w:p>
+    <w:p>
+      <w:pPr>
+        <w:pStyle w:val="Heading2"/>
+        <w:jc w:val="right"/>
+        <w:bidi/>
+      </w:pPr>
+      <w:r>
+        <w:rPr>
+          <w:rFonts w:ascii="David" w:hAnsi="David"/>
+        </w:rPr>
+        <w:t>2.1 ארכיטקטורת Multi-File SPA</w:t>
+      </w:r>
+    </w:p>
     <w:tbl>
       <w:tblPr>
         <w:tblStyle w:val="TableGrid"/>
@@ -126,13 +261,14 @@
         <w:bidiVisual/>
       </w:tblPr>
       <w:tblGrid>
-        <w:gridCol w:w="4320"/>
-        <w:gridCol w:w="4320"/>
+        <w:gridCol w:w="2880"/>
+        <w:gridCol w:w="2880"/>
+        <w:gridCol w:w="2880"/>
       </w:tblGrid>
       <w:tr>
         <w:tc>
           <w:tcPr>
-            <w:tcW w:type="dxa" w:w="4320"/>
+            <w:tcW w:type="dxa" w:w="2880"/>
           </w:tcPr>
           <w:p>
             <w:r>
@@ -142,11 +278,21 @@
         </w:tc>
         <w:tc>
           <w:tcPr>
-            <w:tcW w:type="dxa" w:w="4320"/>
+            <w:tcW w:type="dxa" w:w="2880"/>
           </w:tcPr>
           <w:p>
             <w:r>
               <w:t>ערך</w:t>
+            </w:r>
+          </w:p>
+        </w:tc>
+        <w:tc>
+          <w:tcPr>
+            <w:tcW w:type="dxa" w:w="2880"/>
+          </w:tcPr>
+          <w:p>
+            <w:r>
+              <w:t>תיאור</w:t>
             </w:r>
           </w:p>
         </w:tc>
@@ -154,21 +300,31 @@
       <w:tr>
         <w:tc>
           <w:tcPr>
-            <w:tcW w:type="dxa" w:w="4320"/>
-          </w:tcPr>
-          <w:p>
-            <w:r>
-              <w:t>גודל index.html</w:t>
-            </w:r>
-          </w:p>
-        </w:tc>
-        <w:tc>
-          <w:tcPr>
-            <w:tcW w:type="dxa" w:w="4320"/>
-          </w:tcPr>
-          <w:p>
-            <w:r>
-              <w:t>271 KB</w:t>
+            <w:tcW w:type="dxa" w:w="2880"/>
+          </w:tcPr>
+          <w:p>
+            <w:r>
+              <w:t>index.html</w:t>
+            </w:r>
+          </w:p>
+        </w:tc>
+        <w:tc>
+          <w:tcPr>
+            <w:tcW w:type="dxa" w:w="2880"/>
+          </w:tcPr>
+          <w:p>
+            <w:r>
+              <w:t>303 KB</w:t>
+            </w:r>
+          </w:p>
+        </w:tc>
+        <w:tc>
+          <w:tcPr>
+            <w:tcW w:type="dxa" w:w="2880"/>
+          </w:tcPr>
+          <w:p>
+            <w:r>
+              <w:t>SPA — UI, CSS, JS, מילון, כותרות EN</w:t>
             </w:r>
           </w:p>
         </w:tc>
@@ -176,21 +332,31 @@
       <w:tr>
         <w:tc>
           <w:tcPr>
-            <w:tcW w:type="dxa" w:w="4320"/>
-          </w:tcPr>
-          <w:p>
-            <w:r>
-              <w:t>גודל data.js</w:t>
-            </w:r>
-          </w:p>
-        </w:tc>
-        <w:tc>
-          <w:tcPr>
-            <w:tcW w:type="dxa" w:w="4320"/>
-          </w:tcPr>
-          <w:p>
-            <w:r>
-              <w:t>978 KB</w:t>
+            <w:tcW w:type="dxa" w:w="2880"/>
+          </w:tcPr>
+          <w:p>
+            <w:r>
+              <w:t>data.js</w:t>
+            </w:r>
+          </w:p>
+        </w:tc>
+        <w:tc>
+          <w:tcPr>
+            <w:tcW w:type="dxa" w:w="2880"/>
+          </w:tcPr>
+          <w:p>
+            <w:r>
+              <w:t>1,389 KB</w:t>
+            </w:r>
+          </w:p>
+        </w:tc>
+        <w:tc>
+          <w:tcPr>
+            <w:tcW w:type="dxa" w:w="2880"/>
+          </w:tcPr>
+          <w:p>
+            <w:r>
+              <w:t>1,054 מתכונים, CATS, MENU_STRUCTURE, HOLIDAY_TAGS</w:t>
             </w:r>
           </w:p>
         </w:tc>
@@ -198,21 +364,31 @@
       <w:tr>
         <w:tc>
           <w:tcPr>
-            <w:tcW w:type="dxa" w:w="4320"/>
-          </w:tcPr>
-          <w:p>
-            <w:r>
-              <w:t>גודל pre_en.js</w:t>
-            </w:r>
-          </w:p>
-        </w:tc>
-        <w:tc>
-          <w:tcPr>
-            <w:tcW w:type="dxa" w:w="4320"/>
-          </w:tcPr>
-          <w:p>
-            <w:r>
-              <w:t>771 KB</w:t>
+            <w:tcW w:type="dxa" w:w="2880"/>
+          </w:tcPr>
+          <w:p>
+            <w:r>
+              <w:t>pre_en.js</w:t>
+            </w:r>
+          </w:p>
+        </w:tc>
+        <w:tc>
+          <w:tcPr>
+            <w:tcW w:type="dxa" w:w="2880"/>
+          </w:tcPr>
+          <w:p>
+            <w:r>
+              <w:t>782 KB</w:t>
+            </w:r>
+          </w:p>
+        </w:tc>
+        <w:tc>
+          <w:tcPr>
+            <w:tcW w:type="dxa" w:w="2880"/>
+          </w:tcPr>
+          <w:p>
+            <w:r>
+              <w:t>תרגום EN מוכן: 1,054 × 5 שדות, 0 עברית</w:t>
             </w:r>
           </w:p>
         </w:tc>
@@ -220,21 +396,31 @@
       <w:tr>
         <w:tc>
           <w:tcPr>
-            <w:tcW w:type="dxa" w:w="4320"/>
-          </w:tcPr>
-          <w:p>
-            <w:r>
-              <w:t>מתכונים</w:t>
-            </w:r>
-          </w:p>
-        </w:tc>
-        <w:tc>
-          <w:tcPr>
-            <w:tcW w:type="dxa" w:w="4320"/>
-          </w:tcPr>
-          <w:p>
-            <w:r>
-              <w:t>1,054 (כולל 40 לא כשרים)</w:t>
+            <w:tcW w:type="dxa" w:w="2880"/>
+          </w:tcPr>
+          <w:p>
+            <w:r>
+              <w:t>sw.js</w:t>
+            </w:r>
+          </w:p>
+        </w:tc>
+        <w:tc>
+          <w:tcPr>
+            <w:tcW w:type="dxa" w:w="2880"/>
+          </w:tcPr>
+          <w:p>
+            <w:r>
+              <w:t>2.3 KB</w:t>
+            </w:r>
+          </w:p>
+        </w:tc>
+        <w:tc>
+          <w:tcPr>
+            <w:tcW w:type="dxa" w:w="2880"/>
+          </w:tcPr>
+          <w:p>
+            <w:r>
+              <w:t>Service Worker v9 — cache strategy</w:t>
             </w:r>
           </w:p>
         </w:tc>
@@ -242,21 +428,31 @@
       <w:tr>
         <w:tc>
           <w:tcPr>
-            <w:tcW w:type="dxa" w:w="4320"/>
-          </w:tcPr>
-          <w:p>
-            <w:r>
-              <w:t>קטגוריות</w:t>
-            </w:r>
-          </w:p>
-        </w:tc>
-        <w:tc>
-          <w:tcPr>
-            <w:tcW w:type="dxa" w:w="4320"/>
-          </w:tcPr>
-          <w:p>
-            <w:r>
-              <w:t>19</w:t>
+            <w:tcW w:type="dxa" w:w="2880"/>
+          </w:tcPr>
+          <w:p>
+            <w:r>
+              <w:t>manifest.json</w:t>
+            </w:r>
+          </w:p>
+        </w:tc>
+        <w:tc>
+          <w:tcPr>
+            <w:tcW w:type="dxa" w:w="2880"/>
+          </w:tcPr>
+          <w:p>
+            <w:r>
+              <w:t>575 B</w:t>
+            </w:r>
+          </w:p>
+        </w:tc>
+        <w:tc>
+          <w:tcPr>
+            <w:tcW w:type="dxa" w:w="2880"/>
+          </w:tcPr>
+          <w:p>
+            <w:r>
+              <w:t>PWA manifest</w:t>
             </w:r>
           </w:p>
         </w:tc>
@@ -264,21 +460,31 @@
       <w:tr>
         <w:tc>
           <w:tcPr>
-            <w:tcW w:type="dxa" w:w="4320"/>
-          </w:tcPr>
-          <w:p>
-            <w:r>
-              <w:t>תלויות</w:t>
-            </w:r>
-          </w:p>
-        </w:tc>
-        <w:tc>
-          <w:tcPr>
-            <w:tcW w:type="dxa" w:w="4320"/>
-          </w:tcPr>
-          <w:p>
-            <w:r>
-              <w:t>0 — Vanilla JS</w:t>
+            <w:tcW w:type="dxa" w:w="2880"/>
+          </w:tcPr>
+          <w:p>
+            <w:r>
+              <w:t>מתכונים</w:t>
+            </w:r>
+          </w:p>
+        </w:tc>
+        <w:tc>
+          <w:tcPr>
+            <w:tcW w:type="dxa" w:w="2880"/>
+          </w:tcPr>
+          <w:p>
+            <w:r>
+              <w:t>1,054</w:t>
+            </w:r>
+          </w:p>
+        </w:tc>
+        <w:tc>
+          <w:tcPr>
+            <w:tcW w:type="dxa" w:w="2880"/>
+          </w:tcPr>
+          <w:p>
+            <w:r>
+              <w:t>כולל 40 לא כשרים (nk_*)</w:t>
             </w:r>
           </w:p>
         </w:tc>
@@ -286,21 +492,31 @@
       <w:tr>
         <w:tc>
           <w:tcPr>
-            <w:tcW w:type="dxa" w:w="4320"/>
-          </w:tcPr>
-          <w:p>
-            <w:r>
-              <w:t>שפה</w:t>
-            </w:r>
-          </w:p>
-        </w:tc>
-        <w:tc>
-          <w:tcPr>
-            <w:tcW w:type="dxa" w:w="4320"/>
-          </w:tcPr>
-          <w:p>
-            <w:r>
-              <w:t>עברית RTL + אנגלית מלאה</w:t>
+            <w:tcW w:type="dxa" w:w="2880"/>
+          </w:tcPr>
+          <w:p>
+            <w:r>
+              <w:t>קטגוריות</w:t>
+            </w:r>
+          </w:p>
+        </w:tc>
+        <w:tc>
+          <w:tcPr>
+            <w:tcW w:type="dxa" w:w="2880"/>
+          </w:tcPr>
+          <w:p>
+            <w:r>
+              <w:t>19</w:t>
+            </w:r>
+          </w:p>
+        </w:tc>
+        <w:tc>
+          <w:tcPr>
+            <w:tcW w:type="dxa" w:w="2880"/>
+          </w:tcPr>
+          <w:p>
+            <w:r>
+              <w:t>כולל nonkosher</w:t>
             </w:r>
           </w:p>
         </w:tc>
@@ -308,7 +524,103 @@
       <w:tr>
         <w:tc>
           <w:tcPr>
-            <w:tcW w:type="dxa" w:w="4320"/>
+            <w:tcW w:type="dxa" w:w="2880"/>
+          </w:tcPr>
+          <w:p>
+            <w:r>
+              <w:t>חגים</w:t>
+            </w:r>
+          </w:p>
+        </w:tc>
+        <w:tc>
+          <w:tcPr>
+            <w:tcW w:type="dxa" w:w="2880"/>
+          </w:tcPr>
+          <w:p>
+            <w:r>
+              <w:t>10</w:t>
+            </w:r>
+          </w:p>
+        </w:tc>
+        <w:tc>
+          <w:tcPr>
+            <w:tcW w:type="dxa" w:w="2880"/>
+          </w:tcPr>
+          <w:p>
+            <w:r>
+              <w:t>HOLIDAY_TAGS — רשימות ID</w:t>
+            </w:r>
+          </w:p>
+        </w:tc>
+      </w:tr>
+      <w:tr>
+        <w:tc>
+          <w:tcPr>
+            <w:tcW w:type="dxa" w:w="2880"/>
+          </w:tcPr>
+          <w:p>
+            <w:r>
+              <w:t>תלויות</w:t>
+            </w:r>
+          </w:p>
+        </w:tc>
+        <w:tc>
+          <w:tcPr>
+            <w:tcW w:type="dxa" w:w="2880"/>
+          </w:tcPr>
+          <w:p>
+            <w:r>
+              <w:t>0</w:t>
+            </w:r>
+          </w:p>
+        </w:tc>
+        <w:tc>
+          <w:tcPr>
+            <w:tcW w:type="dxa" w:w="2880"/>
+          </w:tcPr>
+          <w:p>
+            <w:r>
+              <w:t>Vanilla JS — ללא React/Vue/Node</w:t>
+            </w:r>
+          </w:p>
+        </w:tc>
+      </w:tr>
+      <w:tr>
+        <w:tc>
+          <w:tcPr>
+            <w:tcW w:type="dxa" w:w="2880"/>
+          </w:tcPr>
+          <w:p>
+            <w:r>
+              <w:t>שפה</w:t>
+            </w:r>
+          </w:p>
+        </w:tc>
+        <w:tc>
+          <w:tcPr>
+            <w:tcW w:type="dxa" w:w="2880"/>
+          </w:tcPr>
+          <w:p>
+            <w:r>
+              <w:t>עברית RTL + אנגלית</w:t>
+            </w:r>
+          </w:p>
+        </w:tc>
+        <w:tc>
+          <w:tcPr>
+            <w:tcW w:type="dxa" w:w="2880"/>
+          </w:tcPr>
+          <w:p>
+            <w:r>
+              <w:t>dir=rtl lang=he, מנגנון תרגום 3 שכבות</w:t>
+            </w:r>
+          </w:p>
+        </w:tc>
+      </w:tr>
+      <w:tr>
+        <w:tc>
+          <w:tcPr>
+            <w:tcW w:type="dxa" w:w="2880"/>
           </w:tcPr>
           <w:p>
             <w:r>
@@ -318,11 +630,208 @@
         </w:tc>
         <w:tc>
           <w:tcPr>
-            <w:tcW w:type="dxa" w:w="4320"/>
+            <w:tcW w:type="dxa" w:w="2880"/>
           </w:tcPr>
           <w:p>
             <w:r>
               <w:t>img.loading=lazy</w:t>
+            </w:r>
+          </w:p>
+        </w:tc>
+        <w:tc>
+          <w:tcPr>
+            <w:tcW w:type="dxa" w:w="2880"/>
+          </w:tcPr>
+          <w:p>
+            <w:r>
+              <w:t>decoding=async, fetchPriority=low</w:t>
+            </w:r>
+          </w:p>
+        </w:tc>
+      </w:tr>
+    </w:tbl>
+    <w:p>
+      <w:pPr>
+        <w:pStyle w:val="Heading2"/>
+        <w:jc w:val="right"/>
+        <w:bidi/>
+      </w:pPr>
+      <w:r>
+        <w:rPr>
+          <w:rFonts w:ascii="David" w:hAnsi="David"/>
+        </w:rPr>
+        <w:t>2.2 שכבות הארכיטקטורה</w:t>
+      </w:r>
+    </w:p>
+    <w:tbl>
+      <w:tblPr>
+        <w:tblStyle w:val="TableGrid"/>
+        <w:tblW w:type="auto" w:w="0"/>
+        <w:jc w:val="right"/>
+        <w:tblLook w:firstColumn="1" w:firstRow="1" w:lastColumn="0" w:lastRow="0" w:noHBand="0" w:noVBand="1" w:val="04A0"/>
+        <w:bidiVisual/>
+      </w:tblPr>
+      <w:tblGrid>
+        <w:gridCol w:w="2880"/>
+        <w:gridCol w:w="2880"/>
+        <w:gridCol w:w="2880"/>
+      </w:tblGrid>
+      <w:tr>
+        <w:tc>
+          <w:tcPr>
+            <w:tcW w:type="dxa" w:w="2880"/>
+          </w:tcPr>
+          <w:p>
+            <w:r>
+              <w:t>שכבה</w:t>
+            </w:r>
+          </w:p>
+        </w:tc>
+        <w:tc>
+          <w:tcPr>
+            <w:tcW w:type="dxa" w:w="2880"/>
+          </w:tcPr>
+          <w:p>
+            <w:r>
+              <w:t>טכנולוגיה</w:t>
+            </w:r>
+          </w:p>
+        </w:tc>
+        <w:tc>
+          <w:tcPr>
+            <w:tcW w:type="dxa" w:w="2880"/>
+          </w:tcPr>
+          <w:p>
+            <w:r>
+              <w:t>תיאור</w:t>
+            </w:r>
+          </w:p>
+        </w:tc>
+      </w:tr>
+      <w:tr>
+        <w:tc>
+          <w:tcPr>
+            <w:tcW w:type="dxa" w:w="2880"/>
+          </w:tcPr>
+          <w:p>
+            <w:r>
+              <w:t>Presentation</w:t>
+            </w:r>
+          </w:p>
+        </w:tc>
+        <w:tc>
+          <w:tcPr>
+            <w:tcW w:type="dxa" w:w="2880"/>
+          </w:tcPr>
+          <w:p>
+            <w:r>
+              <w:t>HTML5 + CSS3</w:t>
+            </w:r>
+          </w:p>
+        </w:tc>
+        <w:tc>
+          <w:tcPr>
+            <w:tcW w:type="dxa" w:w="2880"/>
+          </w:tcPr>
+          <w:p>
+            <w:r>
+              <w:t>HTML semantic, Grid/Flex, RTL, 34 Custom Properties</w:t>
+            </w:r>
+          </w:p>
+        </w:tc>
+      </w:tr>
+      <w:tr>
+        <w:tc>
+          <w:tcPr>
+            <w:tcW w:type="dxa" w:w="2880"/>
+          </w:tcPr>
+          <w:p>
+            <w:r>
+              <w:t>Application</w:t>
+            </w:r>
+          </w:p>
+        </w:tc>
+        <w:tc>
+          <w:tcPr>
+            <w:tcW w:type="dxa" w:w="2880"/>
+          </w:tcPr>
+          <w:p>
+            <w:r>
+              <w:t>JavaScript ES6+</w:t>
+            </w:r>
+          </w:p>
+        </w:tc>
+        <w:tc>
+          <w:tcPr>
+            <w:tcW w:type="dxa" w:w="2880"/>
+          </w:tcPr>
+          <w:p>
+            <w:r>
+              <w:t>48+ פונקציות: ניווט, סינון, מדיה, מודאל, חיפוש, תרגום</w:t>
+            </w:r>
+          </w:p>
+        </w:tc>
+      </w:tr>
+      <w:tr>
+        <w:tc>
+          <w:tcPr>
+            <w:tcW w:type="dxa" w:w="2880"/>
+          </w:tcPr>
+          <w:p>
+            <w:r>
+              <w:t>Data</w:t>
+            </w:r>
+          </w:p>
+        </w:tc>
+        <w:tc>
+          <w:tcPr>
+            <w:tcW w:type="dxa" w:w="2880"/>
+          </w:tcPr>
+          <w:p>
+            <w:r>
+              <w:t>data.js + pre_en.js</w:t>
+            </w:r>
+          </w:p>
+        </w:tc>
+        <w:tc>
+          <w:tcPr>
+            <w:tcW w:type="dxa" w:w="2880"/>
+          </w:tcPr>
+          <w:p>
+            <w:r>
+              <w:t>1,054 recipes + CATS + MENU + HOLIDAYS + translations</w:t>
+            </w:r>
+          </w:p>
+        </w:tc>
+      </w:tr>
+      <w:tr>
+        <w:tc>
+          <w:tcPr>
+            <w:tcW w:type="dxa" w:w="2880"/>
+          </w:tcPr>
+          <w:p>
+            <w:r>
+              <w:t>Cache</w:t>
+            </w:r>
+          </w:p>
+        </w:tc>
+        <w:tc>
+          <w:tcPr>
+            <w:tcW w:type="dxa" w:w="2880"/>
+          </w:tcPr>
+          <w:p>
+            <w:r>
+              <w:t>sw.js</w:t>
+            </w:r>
+          </w:p>
+        </w:tc>
+        <w:tc>
+          <w:tcPr>
+            <w:tcW w:type="dxa" w:w="2880"/>
+          </w:tcPr>
+          <w:p>
+            <w:r>
+              <w:t>Service Worker — network-first HTML, cache-first images</w:t>
             </w:r>
           </w:p>
         </w:tc>
@@ -338,45 +847,70 @@
         <w:rPr>
           <w:rFonts w:ascii="David" w:hAnsi="David"/>
         </w:rPr>
-        <w:t>3. מבנה קבצים</w:t>
+        <w:t>3. מבנה הנתונים</w:t>
+      </w:r>
+    </w:p>
+    <w:p>
+      <w:pPr>
+        <w:pStyle w:val="Heading2"/>
+        <w:jc w:val="right"/>
+        <w:bidi/>
+      </w:pPr>
+      <w:r>
+        <w:rPr>
+          <w:rFonts w:ascii="David" w:hAnsi="David"/>
+        </w:rPr>
+        <w:t>3.1 Recipe Object Schema</w:t>
       </w:r>
     </w:p>
     <w:tbl>
       <w:tblPr>
         <w:tblStyle w:val="TableGrid"/>
         <w:tblW w:type="auto" w:w="0"/>
+        <w:jc w:val="right"/>
         <w:tblLook w:firstColumn="1" w:firstRow="1" w:lastColumn="0" w:lastRow="0" w:noHBand="0" w:noVBand="1" w:val="04A0"/>
         <w:bidiVisual/>
       </w:tblPr>
       <w:tblGrid>
-        <w:gridCol w:w="2880"/>
-        <w:gridCol w:w="2880"/>
-        <w:gridCol w:w="2880"/>
+        <w:gridCol w:w="2160"/>
+        <w:gridCol w:w="2160"/>
+        <w:gridCol w:w="2160"/>
+        <w:gridCol w:w="2160"/>
       </w:tblGrid>
       <w:tr>
         <w:tc>
           <w:tcPr>
-            <w:tcW w:type="dxa" w:w="2880"/>
-          </w:tcPr>
-          <w:p>
-            <w:r>
-              <w:t>קובץ</w:t>
-            </w:r>
-          </w:p>
-        </w:tc>
-        <w:tc>
-          <w:tcPr>
-            <w:tcW w:type="dxa" w:w="2880"/>
-          </w:tcPr>
-          <w:p>
-            <w:r>
-              <w:t>גודל</w:t>
-            </w:r>
-          </w:p>
-        </w:tc>
-        <w:tc>
-          <w:tcPr>
-            <w:tcW w:type="dxa" w:w="2880"/>
+            <w:tcW w:type="dxa" w:w="2160"/>
+          </w:tcPr>
+          <w:p>
+            <w:r>
+              <w:t>שדה</w:t>
+            </w:r>
+          </w:p>
+        </w:tc>
+        <w:tc>
+          <w:tcPr>
+            <w:tcW w:type="dxa" w:w="2160"/>
+          </w:tcPr>
+          <w:p>
+            <w:r>
+              <w:t>סוג</w:t>
+            </w:r>
+          </w:p>
+        </w:tc>
+        <w:tc>
+          <w:tcPr>
+            <w:tcW w:type="dxa" w:w="2160"/>
+          </w:tcPr>
+          <w:p>
+            <w:r>
+              <w:t>חובה</w:t>
+            </w:r>
+          </w:p>
+        </w:tc>
+        <w:tc>
+          <w:tcPr>
+            <w:tcW w:type="dxa" w:w="2160"/>
           </w:tcPr>
           <w:p>
             <w:r>
@@ -388,31 +922,41 @@
       <w:tr>
         <w:tc>
           <w:tcPr>
-            <w:tcW w:type="dxa" w:w="2880"/>
-          </w:tcPr>
-          <w:p>
-            <w:r>
-              <w:t>index.html</w:t>
-            </w:r>
-          </w:p>
-        </w:tc>
-        <w:tc>
-          <w:tcPr>
-            <w:tcW w:type="dxa" w:w="2880"/>
-          </w:tcPr>
-          <w:p>
-            <w:r>
-              <w:t>271 KB</w:t>
-            </w:r>
-          </w:p>
-        </w:tc>
-        <w:tc>
-          <w:tcPr>
-            <w:tcW w:type="dxa" w:w="2880"/>
-          </w:tcPr>
-          <w:p>
-            <w:r>
-              <w:t>SPA — UI, CSS, JS, מילון תרגום, כותרות EN</w:t>
+            <w:tcW w:type="dxa" w:w="2160"/>
+          </w:tcPr>
+          <w:p>
+            <w:r>
+              <w:t>id</w:t>
+            </w:r>
+          </w:p>
+        </w:tc>
+        <w:tc>
+          <w:tcPr>
+            <w:tcW w:type="dxa" w:w="2160"/>
+          </w:tcPr>
+          <w:p>
+            <w:r>
+              <w:t>string</w:t>
+            </w:r>
+          </w:p>
+        </w:tc>
+        <w:tc>
+          <w:tcPr>
+            <w:tcW w:type="dxa" w:w="2160"/>
+          </w:tcPr>
+          <w:p>
+            <w:r>
+              <w:t>כן</w:t>
+            </w:r>
+          </w:p>
+        </w:tc>
+        <w:tc>
+          <w:tcPr>
+            <w:tcW w:type="dxa" w:w="2160"/>
+          </w:tcPr>
+          <w:p>
+            <w:r>
+              <w:t>מזהה ייחודי: s1, sa2, nk_fn3...</w:t>
             </w:r>
           </w:p>
         </w:tc>
@@ -420,31 +964,41 @@
       <w:tr>
         <w:tc>
           <w:tcPr>
-            <w:tcW w:type="dxa" w:w="2880"/>
-          </w:tcPr>
-          <w:p>
-            <w:r>
-              <w:t>data.js</w:t>
-            </w:r>
-          </w:p>
-        </w:tc>
-        <w:tc>
-          <w:tcPr>
-            <w:tcW w:type="dxa" w:w="2880"/>
-          </w:tcPr>
-          <w:p>
-            <w:r>
-              <w:t>978 KB</w:t>
-            </w:r>
-          </w:p>
-        </w:tc>
-        <w:tc>
-          <w:tcPr>
-            <w:tcW w:type="dxa" w:w="2880"/>
-          </w:tcPr>
-          <w:p>
-            <w:r>
-              <w:t>1,054 מתכונים, CATS, MENU_STRUCTURE, HOLIDAY_TAGS</w:t>
+            <w:tcW w:type="dxa" w:w="2160"/>
+          </w:tcPr>
+          <w:p>
+            <w:r>
+              <w:t>cat</w:t>
+            </w:r>
+          </w:p>
+        </w:tc>
+        <w:tc>
+          <w:tcPr>
+            <w:tcW w:type="dxa" w:w="2160"/>
+          </w:tcPr>
+          <w:p>
+            <w:r>
+              <w:t>string</w:t>
+            </w:r>
+          </w:p>
+        </w:tc>
+        <w:tc>
+          <w:tcPr>
+            <w:tcW w:type="dxa" w:w="2160"/>
+          </w:tcPr>
+          <w:p>
+            <w:r>
+              <w:t>כן</w:t>
+            </w:r>
+          </w:p>
+        </w:tc>
+        <w:tc>
+          <w:tcPr>
+            <w:tcW w:type="dxa" w:w="2160"/>
+          </w:tcPr>
+          <w:p>
+            <w:r>
+              <w:t>קטגוריה: soups, meat, span, nonkosher...</w:t>
             </w:r>
           </w:p>
         </w:tc>
@@ -452,31 +1006,41 @@
       <w:tr>
         <w:tc>
           <w:tcPr>
-            <w:tcW w:type="dxa" w:w="2880"/>
-          </w:tcPr>
-          <w:p>
-            <w:r>
-              <w:t>pre_en.js</w:t>
-            </w:r>
-          </w:p>
-        </w:tc>
-        <w:tc>
-          <w:tcPr>
-            <w:tcW w:type="dxa" w:w="2880"/>
-          </w:tcPr>
-          <w:p>
-            <w:r>
-              <w:t>771 KB</w:t>
-            </w:r>
-          </w:p>
-        </w:tc>
-        <w:tc>
-          <w:tcPr>
-            <w:tcW w:type="dxa" w:w="2880"/>
-          </w:tcPr>
-          <w:p>
-            <w:r>
-              <w:t>תרגום EN מוכן: desc, mem, tip, steps, ingr</w:t>
+            <w:tcW w:type="dxa" w:w="2160"/>
+          </w:tcPr>
+          <w:p>
+            <w:r>
+              <w:t>badge</w:t>
+            </w:r>
+          </w:p>
+        </w:tc>
+        <w:tc>
+          <w:tcPr>
+            <w:tcW w:type="dxa" w:w="2160"/>
+          </w:tcPr>
+          <w:p>
+            <w:r>
+              <w:t>string</w:t>
+            </w:r>
+          </w:p>
+        </w:tc>
+        <w:tc>
+          <w:tcPr>
+            <w:tcW w:type="dxa" w:w="2160"/>
+          </w:tcPr>
+          <w:p>
+            <w:r>
+              <w:t>כן</w:t>
+            </w:r>
+          </w:p>
+        </w:tc>
+        <w:tc>
+          <w:tcPr>
+            <w:tcW w:type="dxa" w:w="2160"/>
+          </w:tcPr>
+          <w:p>
+            <w:r>
+              <w:t>תג תצוגה: מרוקאי, ספרדי, חגיגי, מאפה...</w:t>
             </w:r>
           </w:p>
         </w:tc>
@@ -484,31 +1048,41 @@
       <w:tr>
         <w:tc>
           <w:tcPr>
-            <w:tcW w:type="dxa" w:w="2880"/>
-          </w:tcPr>
-          <w:p>
-            <w:r>
-              <w:t>sw.js</w:t>
-            </w:r>
-          </w:p>
-        </w:tc>
-        <w:tc>
-          <w:tcPr>
-            <w:tcW w:type="dxa" w:w="2880"/>
-          </w:tcPr>
-          <w:p>
-            <w:r>
-              <w:t>2.3 KB</w:t>
-            </w:r>
-          </w:p>
-        </w:tc>
-        <w:tc>
-          <w:tcPr>
-            <w:tcW w:type="dxa" w:w="2880"/>
-          </w:tcPr>
-          <w:p>
-            <w:r>
-              <w:t>Service Worker v9</w:t>
+            <w:tcW w:type="dxa" w:w="2160"/>
+          </w:tcPr>
+          <w:p>
+            <w:r>
+              <w:t>title</w:t>
+            </w:r>
+          </w:p>
+        </w:tc>
+        <w:tc>
+          <w:tcPr>
+            <w:tcW w:type="dxa" w:w="2160"/>
+          </w:tcPr>
+          <w:p>
+            <w:r>
+              <w:t>string</w:t>
+            </w:r>
+          </w:p>
+        </w:tc>
+        <w:tc>
+          <w:tcPr>
+            <w:tcW w:type="dxa" w:w="2160"/>
+          </w:tcPr>
+          <w:p>
+            <w:r>
+              <w:t>כן</w:t>
+            </w:r>
+          </w:p>
+        </w:tc>
+        <w:tc>
+          <w:tcPr>
+            <w:tcW w:type="dxa" w:w="2160"/>
+          </w:tcPr>
+          <w:p>
+            <w:r>
+              <w:t>שם המתכון בעברית</w:t>
             </w:r>
           </w:p>
         </w:tc>
@@ -516,31 +1090,41 @@
       <w:tr>
         <w:tc>
           <w:tcPr>
-            <w:tcW w:type="dxa" w:w="2880"/>
-          </w:tcPr>
-          <w:p>
-            <w:r>
-              <w:t>manifest.json</w:t>
-            </w:r>
-          </w:p>
-        </w:tc>
-        <w:tc>
-          <w:tcPr>
-            <w:tcW w:type="dxa" w:w="2880"/>
-          </w:tcPr>
-          <w:p>
-            <w:r>
-              <w:t>575 B</w:t>
-            </w:r>
-          </w:p>
-        </w:tc>
-        <w:tc>
-          <w:tcPr>
-            <w:tcW w:type="dxa" w:w="2880"/>
-          </w:tcPr>
-          <w:p>
-            <w:r>
-              <w:t>PWA manifest</w:t>
+            <w:tcW w:type="dxa" w:w="2160"/>
+          </w:tcPr>
+          <w:p>
+            <w:r>
+              <w:t>desc</w:t>
+            </w:r>
+          </w:p>
+        </w:tc>
+        <w:tc>
+          <w:tcPr>
+            <w:tcW w:type="dxa" w:w="2160"/>
+          </w:tcPr>
+          <w:p>
+            <w:r>
+              <w:t>string</w:t>
+            </w:r>
+          </w:p>
+        </w:tc>
+        <w:tc>
+          <w:tcPr>
+            <w:tcW w:type="dxa" w:w="2160"/>
+          </w:tcPr>
+          <w:p>
+            <w:r>
+              <w:t>כן</w:t>
+            </w:r>
+          </w:p>
+        </w:tc>
+        <w:tc>
+          <w:tcPr>
+            <w:tcW w:type="dxa" w:w="2160"/>
+          </w:tcPr>
+          <w:p>
+            <w:r>
+              <w:t>תיאור קצר</w:t>
             </w:r>
           </w:p>
         </w:tc>
@@ -548,31 +1132,41 @@
       <w:tr>
         <w:tc>
           <w:tcPr>
-            <w:tcW w:type="dxa" w:w="2880"/>
-          </w:tcPr>
-          <w:p>
-            <w:r>
-              <w:t>download_images.py</w:t>
-            </w:r>
-          </w:p>
-        </w:tc>
-        <w:tc>
-          <w:tcPr>
-            <w:tcW w:type="dxa" w:w="2880"/>
-          </w:tcPr>
-          <w:p>
-            <w:r>
-              <w:t>104 KB</w:t>
-            </w:r>
-          </w:p>
-        </w:tc>
-        <w:tc>
-          <w:tcPr>
-            <w:tcW w:type="dxa" w:w="2880"/>
-          </w:tcPr>
-          <w:p>
-            <w:r>
-              <w:t>810 search terms, 5 מקורות תמונות</w:t>
+            <w:tcW w:type="dxa" w:w="2160"/>
+          </w:tcPr>
+          <w:p>
+            <w:r>
+              <w:t>time</w:t>
+            </w:r>
+          </w:p>
+        </w:tc>
+        <w:tc>
+          <w:tcPr>
+            <w:tcW w:type="dxa" w:w="2160"/>
+          </w:tcPr>
+          <w:p>
+            <w:r>
+              <w:t>string</w:t>
+            </w:r>
+          </w:p>
+        </w:tc>
+        <w:tc>
+          <w:tcPr>
+            <w:tcW w:type="dxa" w:w="2160"/>
+          </w:tcPr>
+          <w:p>
+            <w:r>
+              <w:t>כן</w:t>
+            </w:r>
+          </w:p>
+        </w:tc>
+        <w:tc>
+          <w:tcPr>
+            <w:tcW w:type="dxa" w:w="2160"/>
+          </w:tcPr>
+          <w:p>
+            <w:r>
+              <w:t>זמן הכנה (30 דקות)</w:t>
             </w:r>
           </w:p>
         </w:tc>
@@ -580,31 +1174,41 @@
       <w:tr>
         <w:tc>
           <w:tcPr>
-            <w:tcW w:type="dxa" w:w="2880"/>
-          </w:tcPr>
-          <w:p>
-            <w:r>
-              <w:t>cleanup_hardlinks.py</w:t>
-            </w:r>
-          </w:p>
-        </w:tc>
-        <w:tc>
-          <w:tcPr>
-            <w:tcW w:type="dxa" w:w="2880"/>
-          </w:tcPr>
-          <w:p>
-            <w:r>
-              <w:t>3.3 KB</w:t>
-            </w:r>
-          </w:p>
-        </w:tc>
-        <w:tc>
-          <w:tcPr>
-            <w:tcW w:type="dxa" w:w="2880"/>
-          </w:tcPr>
-          <w:p>
-            <w:r>
-              <w:t>SHA256 dedup + _IMG_ALIAS.js</w:t>
+            <w:tcW w:type="dxa" w:w="2160"/>
+          </w:tcPr>
+          <w:p>
+            <w:r>
+              <w:t>serv</w:t>
+            </w:r>
+          </w:p>
+        </w:tc>
+        <w:tc>
+          <w:tcPr>
+            <w:tcW w:type="dxa" w:w="2160"/>
+          </w:tcPr>
+          <w:p>
+            <w:r>
+              <w:t>string</w:t>
+            </w:r>
+          </w:p>
+        </w:tc>
+        <w:tc>
+          <w:tcPr>
+            <w:tcW w:type="dxa" w:w="2160"/>
+          </w:tcPr>
+          <w:p>
+            <w:r>
+              <w:t>כן</w:t>
+            </w:r>
+          </w:p>
+        </w:tc>
+        <w:tc>
+          <w:tcPr>
+            <w:tcW w:type="dxa" w:w="2160"/>
+          </w:tcPr>
+          <w:p>
+            <w:r>
+              <w:t>מנות (4 מנות)</w:t>
             </w:r>
           </w:p>
         </w:tc>
@@ -612,31 +1216,335 @@
       <w:tr>
         <w:tc>
           <w:tcPr>
-            <w:tcW w:type="dxa" w:w="2880"/>
-          </w:tcPr>
-          <w:p>
-            <w:r>
-              <w:t>.gitignore</w:t>
-            </w:r>
-          </w:p>
-        </w:tc>
-        <w:tc>
-          <w:tcPr>
-            <w:tcW w:type="dxa" w:w="2880"/>
-          </w:tcPr>
-          <w:p>
-            <w:r>
-              <w:t>224 B</w:t>
-            </w:r>
-          </w:p>
-        </w:tc>
-        <w:tc>
-          <w:tcPr>
-            <w:tcW w:type="dxa" w:w="2880"/>
-          </w:tcPr>
-          <w:p>
-            <w:r>
-              <w:t>מסנן קבצי פרויקט</w:t>
+            <w:tcW w:type="dxa" w:w="2160"/>
+          </w:tcPr>
+          <w:p>
+            <w:r>
+              <w:t>diff</w:t>
+            </w:r>
+          </w:p>
+        </w:tc>
+        <w:tc>
+          <w:tcPr>
+            <w:tcW w:type="dxa" w:w="2160"/>
+          </w:tcPr>
+          <w:p>
+            <w:r>
+              <w:t>string</w:t>
+            </w:r>
+          </w:p>
+        </w:tc>
+        <w:tc>
+          <w:tcPr>
+            <w:tcW w:type="dxa" w:w="2160"/>
+          </w:tcPr>
+          <w:p>
+            <w:r>
+              <w:t>כן</w:t>
+            </w:r>
+          </w:p>
+        </w:tc>
+        <w:tc>
+          <w:tcPr>
+            <w:tcW w:type="dxa" w:w="2160"/>
+          </w:tcPr>
+          <w:p>
+            <w:r>
+              <w:t>קושי: קל / בינוני / מתקדם</w:t>
+            </w:r>
+          </w:p>
+        </w:tc>
+      </w:tr>
+      <w:tr>
+        <w:tc>
+          <w:tcPr>
+            <w:tcW w:type="dxa" w:w="2160"/>
+          </w:tcPr>
+          <w:p>
+            <w:r>
+              <w:t>img</w:t>
+            </w:r>
+          </w:p>
+        </w:tc>
+        <w:tc>
+          <w:tcPr>
+            <w:tcW w:type="dxa" w:w="2160"/>
+          </w:tcPr>
+          <w:p>
+            <w:r>
+              <w:t>string</w:t>
+            </w:r>
+          </w:p>
+        </w:tc>
+        <w:tc>
+          <w:tcPr>
+            <w:tcW w:type="dxa" w:w="2160"/>
+          </w:tcPr>
+          <w:p>
+            <w:r>
+              <w:t>כן</w:t>
+            </w:r>
+          </w:p>
+        </w:tc>
+        <w:tc>
+          <w:tcPr>
+            <w:tcW w:type="dxa" w:w="2160"/>
+          </w:tcPr>
+          <w:p>
+            <w:r>
+              <w:t>URL תמונה ברירת מחדל (loremflickr)</w:t>
+            </w:r>
+          </w:p>
+        </w:tc>
+      </w:tr>
+      <w:tr>
+        <w:tc>
+          <w:tcPr>
+            <w:tcW w:type="dxa" w:w="2160"/>
+          </w:tcPr>
+          <w:p>
+            <w:r>
+              <w:t>mem</w:t>
+            </w:r>
+          </w:p>
+        </w:tc>
+        <w:tc>
+          <w:tcPr>
+            <w:tcW w:type="dxa" w:w="2160"/>
+          </w:tcPr>
+          <w:p>
+            <w:r>
+              <w:t>string</w:t>
+            </w:r>
+          </w:p>
+        </w:tc>
+        <w:tc>
+          <w:tcPr>
+            <w:tcW w:type="dxa" w:w="2160"/>
+          </w:tcPr>
+          <w:p>
+            <w:r>
+              <w:t>לא</w:t>
+            </w:r>
+          </w:p>
+        </w:tc>
+        <w:tc>
+          <w:tcPr>
+            <w:tcW w:type="dxa" w:w="2160"/>
+          </w:tcPr>
+          <w:p>
+            <w:r>
+              <w:t>זיכרון ממרוקו — טקסט רגשי</w:t>
+            </w:r>
+          </w:p>
+        </w:tc>
+      </w:tr>
+      <w:tr>
+        <w:tc>
+          <w:tcPr>
+            <w:tcW w:type="dxa" w:w="2160"/>
+          </w:tcPr>
+          <w:p>
+            <w:r>
+              <w:t>ingr</w:t>
+            </w:r>
+          </w:p>
+        </w:tc>
+        <w:tc>
+          <w:tcPr>
+            <w:tcW w:type="dxa" w:w="2160"/>
+          </w:tcPr>
+          <w:p>
+            <w:r>
+              <w:t>Array&lt;{q,i}&gt;</w:t>
+            </w:r>
+          </w:p>
+        </w:tc>
+        <w:tc>
+          <w:tcPr>
+            <w:tcW w:type="dxa" w:w="2160"/>
+          </w:tcPr>
+          <w:p>
+            <w:r>
+              <w:t>כן</w:t>
+            </w:r>
+          </w:p>
+        </w:tc>
+        <w:tc>
+          <w:tcPr>
+            <w:tcW w:type="dxa" w:w="2160"/>
+          </w:tcPr>
+          <w:p>
+            <w:r>
+              <w:t>מרכיבים: q=כמות, i=מרכיב</w:t>
+            </w:r>
+          </w:p>
+        </w:tc>
+      </w:tr>
+      <w:tr>
+        <w:tc>
+          <w:tcPr>
+            <w:tcW w:type="dxa" w:w="2160"/>
+          </w:tcPr>
+          <w:p>
+            <w:r>
+              <w:t>steps</w:t>
+            </w:r>
+          </w:p>
+        </w:tc>
+        <w:tc>
+          <w:tcPr>
+            <w:tcW w:type="dxa" w:w="2160"/>
+          </w:tcPr>
+          <w:p>
+            <w:r>
+              <w:t>Array&lt;{t,s}&gt;</w:t>
+            </w:r>
+          </w:p>
+        </w:tc>
+        <w:tc>
+          <w:tcPr>
+            <w:tcW w:type="dxa" w:w="2160"/>
+          </w:tcPr>
+          <w:p>
+            <w:r>
+              <w:t>כן</w:t>
+            </w:r>
+          </w:p>
+        </w:tc>
+        <w:tc>
+          <w:tcPr>
+            <w:tcW w:type="dxa" w:w="2160"/>
+          </w:tcPr>
+          <w:p>
+            <w:r>
+              <w:t>שלבים: t=זמן, s=הוראה</w:t>
+            </w:r>
+          </w:p>
+        </w:tc>
+      </w:tr>
+      <w:tr>
+        <w:tc>
+          <w:tcPr>
+            <w:tcW w:type="dxa" w:w="2160"/>
+          </w:tcPr>
+          <w:p>
+            <w:r>
+              <w:t>tip</w:t>
+            </w:r>
+          </w:p>
+        </w:tc>
+        <w:tc>
+          <w:tcPr>
+            <w:tcW w:type="dxa" w:w="2160"/>
+          </w:tcPr>
+          <w:p>
+            <w:r>
+              <w:t>string</w:t>
+            </w:r>
+          </w:p>
+        </w:tc>
+        <w:tc>
+          <w:tcPr>
+            <w:tcW w:type="dxa" w:w="2160"/>
+          </w:tcPr>
+          <w:p>
+            <w:r>
+              <w:t>לא</w:t>
+            </w:r>
+          </w:p>
+        </w:tc>
+        <w:tc>
+          <w:tcPr>
+            <w:tcW w:type="dxa" w:w="2160"/>
+          </w:tcPr>
+          <w:p>
+            <w:r>
+              <w:t>טיפ</w:t>
+            </w:r>
+          </w:p>
+        </w:tc>
+      </w:tr>
+      <w:tr>
+        <w:tc>
+          <w:tcPr>
+            <w:tcW w:type="dxa" w:w="2160"/>
+          </w:tcPr>
+          <w:p>
+            <w:r>
+              <w:t>src</w:t>
+            </w:r>
+          </w:p>
+        </w:tc>
+        <w:tc>
+          <w:tcPr>
+            <w:tcW w:type="dxa" w:w="2160"/>
+          </w:tcPr>
+          <w:p>
+            <w:r>
+              <w:t>string</w:t>
+            </w:r>
+          </w:p>
+        </w:tc>
+        <w:tc>
+          <w:tcPr>
+            <w:tcW w:type="dxa" w:w="2160"/>
+          </w:tcPr>
+          <w:p>
+            <w:r>
+              <w:t>לא</w:t>
+            </w:r>
+          </w:p>
+        </w:tc>
+        <w:tc>
+          <w:tcPr>
+            <w:tcW w:type="dxa" w:w="2160"/>
+          </w:tcPr>
+          <w:p>
+            <w:r>
+              <w:t>קישור למקור</w:t>
+            </w:r>
+          </w:p>
+        </w:tc>
+      </w:tr>
+      <w:tr>
+        <w:tc>
+          <w:tcPr>
+            <w:tcW w:type="dxa" w:w="2160"/>
+          </w:tcPr>
+          <w:p>
+            <w:r>
+              <w:t>vid</w:t>
+            </w:r>
+          </w:p>
+        </w:tc>
+        <w:tc>
+          <w:tcPr>
+            <w:tcW w:type="dxa" w:w="2160"/>
+          </w:tcPr>
+          <w:p>
+            <w:r>
+              <w:t>string</w:t>
+            </w:r>
+          </w:p>
+        </w:tc>
+        <w:tc>
+          <w:tcPr>
+            <w:tcW w:type="dxa" w:w="2160"/>
+          </w:tcPr>
+          <w:p>
+            <w:r>
+              <w:t>לא</w:t>
+            </w:r>
+          </w:p>
+        </w:tc>
+        <w:tc>
+          <w:tcPr>
+            <w:tcW w:type="dxa" w:w="2160"/>
+          </w:tcPr>
+          <w:p>
+            <w:r>
+              <w:t>קישור לסרטון YouTube</w:t>
             </w:r>
           </w:p>
         </w:tc>
@@ -664,25 +1572,38 @@
         <w:rPr>
           <w:rFonts w:ascii="David" w:hAnsi="David"/>
         </w:rPr>
-        <w:t>כפתור יחיד "כל המתכונים" עם dropdown מרובה רמות:</w:t>
+        <w:t>התפריט בנוי מכפתור יחיד "כל המתכונים" (key: all_master) עם dropdown מרובה רמות. כל הקטגוריות מקוננות תחת "מטעמים של אמא ממרוקו":</w:t>
+      </w:r>
+    </w:p>
+    <w:p>
+      <w:pPr>
+        <w:jc w:val="right"/>
+        <w:bidi/>
+      </w:pPr>
+      <w:r>
+        <w:rPr>
+          <w:rFonts w:ascii="David" w:hAnsi="David"/>
+        </w:rPr>
       </w:r>
     </w:p>
     <w:tbl>
       <w:tblPr>
         <w:tblStyle w:val="TableGrid"/>
         <w:tblW w:type="auto" w:w="0"/>
+        <w:jc w:val="right"/>
         <w:tblLook w:firstColumn="1" w:firstRow="1" w:lastColumn="0" w:lastRow="0" w:noHBand="0" w:noVBand="1" w:val="04A0"/>
         <w:bidiVisual/>
       </w:tblPr>
       <w:tblGrid>
-        <w:gridCol w:w="2880"/>
-        <w:gridCol w:w="2880"/>
-        <w:gridCol w:w="2880"/>
+        <w:gridCol w:w="2160"/>
+        <w:gridCol w:w="2160"/>
+        <w:gridCol w:w="2160"/>
+        <w:gridCol w:w="2160"/>
       </w:tblGrid>
       <w:tr>
         <w:tc>
           <w:tcPr>
-            <w:tcW w:type="dxa" w:w="2880"/>
+            <w:tcW w:type="dxa" w:w="2160"/>
           </w:tcPr>
           <w:p>
             <w:r>
@@ -692,7 +1613,17 @@
         </w:tc>
         <w:tc>
           <w:tcPr>
-            <w:tcW w:type="dxa" w:w="2880"/>
+            <w:tcW w:type="dxa" w:w="2160"/>
+          </w:tcPr>
+          <w:p>
+            <w:r>
+              <w:t>סוג</w:t>
+            </w:r>
+          </w:p>
+        </w:tc>
+        <w:tc>
+          <w:tcPr>
+            <w:tcW w:type="dxa" w:w="2160"/>
           </w:tcPr>
           <w:p>
             <w:r>
@@ -702,7 +1633,7 @@
         </w:tc>
         <w:tc>
           <w:tcPr>
-            <w:tcW w:type="dxa" w:w="2880"/>
+            <w:tcW w:type="dxa" w:w="2160"/>
           </w:tcPr>
           <w:p>
             <w:r>
@@ -714,7 +1645,7 @@
       <w:tr>
         <w:tc>
           <w:tcPr>
-            <w:tcW w:type="dxa" w:w="2880"/>
+            <w:tcW w:type="dxa" w:w="2160"/>
           </w:tcPr>
           <w:p>
             <w:r>
@@ -724,17 +1655,27 @@
         </w:tc>
         <w:tc>
           <w:tcPr>
-            <w:tcW w:type="dxa" w:w="2880"/>
-          </w:tcPr>
-          <w:p>
-            <w:r>
-              <w:t>מרקים, סלטים, מנות עיקריות (בשר/עוף/דגים), ירקות, חגים (10), קינוחים, מורשת ספרד (8 תתי)</w:t>
-            </w:r>
-          </w:p>
-        </w:tc>
-        <w:tc>
-          <w:tcPr>
-            <w:tcW w:type="dxa" w:w="2880"/>
+            <w:tcW w:type="dxa" w:w="2160"/>
+          </w:tcPr>
+          <w:p>
+            <w:r>
+              <w:t>accordion + ids</w:t>
+            </w:r>
+          </w:p>
+        </w:tc>
+        <w:tc>
+          <w:tcPr>
+            <w:tcW w:type="dxa" w:w="2160"/>
+          </w:tcPr>
+          <w:p>
+            <w:r>
+              <w:t>מרקים, סלטים, מנות עיקריות (3), ירקות, חגים (10), קינוחים</w:t>
+            </w:r>
+          </w:p>
+        </w:tc>
+        <w:tc>
+          <w:tcPr>
+            <w:tcW w:type="dxa" w:w="2160"/>
           </w:tcPr>
           <w:p>
             <w:r>
@@ -746,31 +1687,41 @@
       <w:tr>
         <w:tc>
           <w:tcPr>
-            <w:tcW w:type="dxa" w:w="2880"/>
-          </w:tcPr>
-          <w:p>
-            <w:r>
-              <w:t>מורשת ספרד (בתוך מטעמי אמא)</w:t>
-            </w:r>
-          </w:p>
-        </w:tc>
-        <w:tc>
-          <w:tcPr>
-            <w:tcW w:type="dxa" w:w="2880"/>
-          </w:tcPr>
-          <w:p>
-            <w:r>
-              <w:t>מרקים, בשר, דגים, ירקות, שבת, רטבים, לחמים, קינוחים</w:t>
-            </w:r>
-          </w:p>
-        </w:tc>
-        <w:tc>
-          <w:tcPr>
-            <w:tcW w:type="dxa" w:w="2880"/>
-          </w:tcPr>
-          <w:p>
-            <w:r>
-              <w:t>73</w:t>
+            <w:tcW w:type="dxa" w:w="2160"/>
+          </w:tcPr>
+          <w:p>
+            <w:r>
+              <w:t>├ מנות עיקריות</w:t>
+            </w:r>
+          </w:p>
+        </w:tc>
+        <w:tc>
+          <w:tcPr>
+            <w:tcW w:type="dxa" w:w="2160"/>
+          </w:tcPr>
+          <w:p>
+            <w:r>
+              <w:t>nested accordion</w:t>
+            </w:r>
+          </w:p>
+        </w:tc>
+        <w:tc>
+          <w:tcPr>
+            <w:tcW w:type="dxa" w:w="2160"/>
+          </w:tcPr>
+          <w:p>
+            <w:r>
+              <w:t>בשר (82), עוף (66), דגים (70)</w:t>
+            </w:r>
+          </w:p>
+        </w:tc>
+        <w:tc>
+          <w:tcPr>
+            <w:tcW w:type="dxa" w:w="2160"/>
+          </w:tcPr>
+          <w:p>
+            <w:r>
+              <w:t>218</w:t>
             </w:r>
           </w:p>
         </w:tc>
@@ -778,31 +1729,41 @@
       <w:tr>
         <w:tc>
           <w:tcPr>
-            <w:tcW w:type="dxa" w:w="2880"/>
-          </w:tcPr>
-          <w:p>
-            <w:r>
-              <w:t>מתכונים מהעדות</w:t>
-            </w:r>
-          </w:p>
-        </w:tc>
-        <w:tc>
-          <w:tcPr>
-            <w:tcW w:type="dxa" w:w="2880"/>
-          </w:tcPr>
-          <w:p>
-            <w:r>
-              <w:t>9 עדות + מטבח ישראלי (4 תתי-קטגוריות)</w:t>
-            </w:r>
-          </w:p>
-        </w:tc>
-        <w:tc>
-          <w:tcPr>
-            <w:tcW w:type="dxa" w:w="2880"/>
-          </w:tcPr>
-          <w:p>
-            <w:r>
-              <w:t>270</w:t>
+            <w:tcW w:type="dxa" w:w="2160"/>
+          </w:tcPr>
+          <w:p>
+            <w:r>
+              <w:t>├ חגים ומועדים</w:t>
+            </w:r>
+          </w:p>
+        </w:tc>
+        <w:tc>
+          <w:tcPr>
+            <w:tcW w:type="dxa" w:w="2160"/>
+          </w:tcPr>
+          <w:p>
+            <w:r>
+              <w:t>leaf + sub[]</w:t>
+            </w:r>
+          </w:p>
+        </w:tc>
+        <w:tc>
+          <w:tcPr>
+            <w:tcW w:type="dxa" w:w="2160"/>
+          </w:tcPr>
+          <w:p>
+            <w:r>
+              <w:t>10 חגים</w:t>
+            </w:r>
+          </w:p>
+        </w:tc>
+        <w:tc>
+          <w:tcPr>
+            <w:tcW w:type="dxa" w:w="2160"/>
+          </w:tcPr>
+          <w:p>
+            <w:r>
+              <w:t>80</w:t>
             </w:r>
           </w:p>
         </w:tc>
@@ -810,31 +1771,41 @@
       <w:tr>
         <w:tc>
           <w:tcPr>
-            <w:tcW w:type="dxa" w:w="2880"/>
-          </w:tcPr>
-          <w:p>
-            <w:r>
-              <w:t>מתכונים לא כשרים</w:t>
-            </w:r>
-          </w:p>
-        </w:tc>
-        <w:tc>
-          <w:tcPr>
-            <w:tcW w:type="dxa" w:w="2880"/>
-          </w:tcPr>
-          <w:p>
-            <w:r>
-              <w:t>פירות ים (14), בשר וחלב (26)</w:t>
-            </w:r>
-          </w:p>
-        </w:tc>
-        <w:tc>
-          <w:tcPr>
-            <w:tcW w:type="dxa" w:w="2880"/>
-          </w:tcPr>
-          <w:p>
-            <w:r>
-              <w:t>40</w:t>
+            <w:tcW w:type="dxa" w:w="2160"/>
+          </w:tcPr>
+          <w:p>
+            <w:r>
+              <w:t>├ מורשת ספרד</w:t>
+            </w:r>
+          </w:p>
+        </w:tc>
+        <w:tc>
+          <w:tcPr>
+            <w:tcW w:type="dxa" w:w="2160"/>
+          </w:tcPr>
+          <w:p>
+            <w:r>
+              <w:t>accordion + ids[]</w:t>
+            </w:r>
+          </w:p>
+        </w:tc>
+        <w:tc>
+          <w:tcPr>
+            <w:tcW w:type="dxa" w:w="2160"/>
+          </w:tcPr>
+          <w:p>
+            <w:r>
+              <w:t>8 תתי: מרקים, בשר, דגים, ירקות, שבת, רטבים, לחמים, קינוחים</w:t>
+            </w:r>
+          </w:p>
+        </w:tc>
+        <w:tc>
+          <w:tcPr>
+            <w:tcW w:type="dxa" w:w="2160"/>
+          </w:tcPr>
+          <w:p>
+            <w:r>
+              <w:t>73</w:t>
             </w:r>
           </w:p>
         </w:tc>
@@ -842,7 +1813,133 @@
       <w:tr>
         <w:tc>
           <w:tcPr>
-            <w:tcW w:type="dxa" w:w="2880"/>
+            <w:tcW w:type="dxa" w:w="2160"/>
+          </w:tcPr>
+          <w:p>
+            <w:r>
+              <w:t>מתכונים מהעדות</w:t>
+            </w:r>
+          </w:p>
+        </w:tc>
+        <w:tc>
+          <w:tcPr>
+            <w:tcW w:type="dxa" w:w="2160"/>
+          </w:tcPr>
+          <w:p>
+            <w:r>
+              <w:t>accordion + ids</w:t>
+            </w:r>
+          </w:p>
+        </w:tc>
+        <w:tc>
+          <w:tcPr>
+            <w:tcW w:type="dxa" w:w="2160"/>
+          </w:tcPr>
+          <w:p>
+            <w:r>
+              <w:t>9 עדות + מטבח ישראלי (4 תתי)</w:t>
+            </w:r>
+          </w:p>
+        </w:tc>
+        <w:tc>
+          <w:tcPr>
+            <w:tcW w:type="dxa" w:w="2160"/>
+          </w:tcPr>
+          <w:p>
+            <w:r>
+              <w:t>270</w:t>
+            </w:r>
+          </w:p>
+        </w:tc>
+      </w:tr>
+      <w:tr>
+        <w:tc>
+          <w:tcPr>
+            <w:tcW w:type="dxa" w:w="2160"/>
+          </w:tcPr>
+          <w:p>
+            <w:r>
+              <w:t>├ מטבח ישראלי</w:t>
+            </w:r>
+          </w:p>
+        </w:tc>
+        <w:tc>
+          <w:tcPr>
+            <w:tcW w:type="dxa" w:w="2160"/>
+          </w:tcPr>
+          <w:p>
+            <w:r>
+              <w:t>nested accordion</w:t>
+            </w:r>
+          </w:p>
+        </w:tc>
+        <w:tc>
+          <w:tcPr>
+            <w:tcW w:type="dxa" w:w="2160"/>
+          </w:tcPr>
+          <w:p>
+            <w:r>
+              <w:t>רחוב (10), עיקריות (9), לחמים (4), קינוחים (7)</w:t>
+            </w:r>
+          </w:p>
+        </w:tc>
+        <w:tc>
+          <w:tcPr>
+            <w:tcW w:type="dxa" w:w="2160"/>
+          </w:tcPr>
+          <w:p>
+            <w:r>
+              <w:t>30</w:t>
+            </w:r>
+          </w:p>
+        </w:tc>
+      </w:tr>
+      <w:tr>
+        <w:tc>
+          <w:tcPr>
+            <w:tcW w:type="dxa" w:w="2160"/>
+          </w:tcPr>
+          <w:p>
+            <w:r>
+              <w:t>מתכונים לא כשרים</w:t>
+            </w:r>
+          </w:p>
+        </w:tc>
+        <w:tc>
+          <w:tcPr>
+            <w:tcW w:type="dxa" w:w="2160"/>
+          </w:tcPr>
+          <w:p>
+            <w:r>
+              <w:t>accordion + ids[]</w:t>
+            </w:r>
+          </w:p>
+        </w:tc>
+        <w:tc>
+          <w:tcPr>
+            <w:tcW w:type="dxa" w:w="2160"/>
+          </w:tcPr>
+          <w:p>
+            <w:r>
+              <w:t>פירות ים (14), בשר וחלב (26)</w:t>
+            </w:r>
+          </w:p>
+        </w:tc>
+        <w:tc>
+          <w:tcPr>
+            <w:tcW w:type="dxa" w:w="2160"/>
+          </w:tcPr>
+          <w:p>
+            <w:r>
+              <w:t>40</w:t>
+            </w:r>
+          </w:p>
+        </w:tc>
+      </w:tr>
+      <w:tr>
+        <w:tc>
+          <w:tcPr>
+            <w:tcW w:type="dxa" w:w="2160"/>
           </w:tcPr>
           <w:p>
             <w:r>
@@ -852,7 +1949,7 @@
         </w:tc>
         <w:tc>
           <w:tcPr>
-            <w:tcW w:type="dxa" w:w="2880"/>
+            <w:tcW w:type="dxa" w:w="2160"/>
           </w:tcPr>
           <w:p>
             <w:r/>
@@ -860,7 +1957,15 @@
         </w:tc>
         <w:tc>
           <w:tcPr>
-            <w:tcW w:type="dxa" w:w="2880"/>
+            <w:tcW w:type="dxa" w:w="2160"/>
+          </w:tcPr>
+          <w:p>
+            <w:r/>
+          </w:p>
+        </w:tc>
+        <w:tc>
+          <w:tcPr>
+            <w:tcW w:type="dxa" w:w="2160"/>
           </w:tcPr>
           <w:p>
             <w:r>
@@ -887,19 +1992,21 @@
       <w:tblPr>
         <w:tblStyle w:val="TableGrid"/>
         <w:tblW w:type="auto" w:w="0"/>
+        <w:jc w:val="right"/>
         <w:tblLook w:firstColumn="1" w:firstRow="1" w:lastColumn="0" w:lastRow="0" w:noHBand="0" w:noVBand="1" w:val="04A0"/>
         <w:bidiVisual/>
       </w:tblPr>
       <w:tblGrid>
-        <w:gridCol w:w="2160"/>
-        <w:gridCol w:w="2160"/>
-        <w:gridCol w:w="2160"/>
-        <w:gridCol w:w="2160"/>
+        <w:gridCol w:w="1728"/>
+        <w:gridCol w:w="1728"/>
+        <w:gridCol w:w="1728"/>
+        <w:gridCol w:w="1728"/>
+        <w:gridCol w:w="1728"/>
       </w:tblGrid>
       <w:tr>
         <w:tc>
           <w:tcPr>
-            <w:tcW w:type="dxa" w:w="2160"/>
+            <w:tcW w:type="dxa" w:w="1728"/>
           </w:tcPr>
           <w:p>
             <w:r>
@@ -909,7 +2016,7 @@
         </w:tc>
         <w:tc>
           <w:tcPr>
-            <w:tcW w:type="dxa" w:w="2160"/>
+            <w:tcW w:type="dxa" w:w="1728"/>
           </w:tcPr>
           <w:p>
             <w:r>
@@ -919,7 +2026,7 @@
         </w:tc>
         <w:tc>
           <w:tcPr>
-            <w:tcW w:type="dxa" w:w="2160"/>
+            <w:tcW w:type="dxa" w:w="1728"/>
           </w:tcPr>
           <w:p>
             <w:r>
@@ -929,11 +2036,21 @@
         </w:tc>
         <w:tc>
           <w:tcPr>
-            <w:tcW w:type="dxa" w:w="2160"/>
+            <w:tcW w:type="dxa" w:w="1728"/>
           </w:tcPr>
           <w:p>
             <w:r>
               <w:t>קבוצה</w:t>
+            </w:r>
+          </w:p>
+        </w:tc>
+        <w:tc>
+          <w:tcPr>
+            <w:tcW w:type="dxa" w:w="1728"/>
+          </w:tcPr>
+          <w:p>
+            <w:r>
+              <w:t>הערות</w:t>
             </w:r>
           </w:p>
         </w:tc>
@@ -941,7 +2058,7 @@
       <w:tr>
         <w:tc>
           <w:tcPr>
-            <w:tcW w:type="dxa" w:w="2160"/>
+            <w:tcW w:type="dxa" w:w="1728"/>
           </w:tcPr>
           <w:p>
             <w:r>
@@ -951,7 +2068,7 @@
         </w:tc>
         <w:tc>
           <w:tcPr>
-            <w:tcW w:type="dxa" w:w="2160"/>
+            <w:tcW w:type="dxa" w:w="1728"/>
           </w:tcPr>
           <w:p>
             <w:r>
@@ -961,7 +2078,7 @@
         </w:tc>
         <w:tc>
           <w:tcPr>
-            <w:tcW w:type="dxa" w:w="2160"/>
+            <w:tcW w:type="dxa" w:w="1728"/>
           </w:tcPr>
           <w:p>
             <w:r>
@@ -971,11 +2088,21 @@
         </w:tc>
         <w:tc>
           <w:tcPr>
-            <w:tcW w:type="dxa" w:w="2160"/>
+            <w:tcW w:type="dxa" w:w="1728"/>
           </w:tcPr>
           <w:p>
             <w:r>
               <w:t>מטעמי אמא</w:t>
+            </w:r>
+          </w:p>
+        </w:tc>
+        <w:tc>
+          <w:tcPr>
+            <w:tcW w:type="dxa" w:w="1728"/>
+          </w:tcPr>
+          <w:p>
+            <w:r>
+              <w:t>חרירה, עדשים, ירקות</w:t>
             </w:r>
           </w:p>
         </w:tc>
@@ -983,7 +2110,7 @@
       <w:tr>
         <w:tc>
           <w:tcPr>
-            <w:tcW w:type="dxa" w:w="2160"/>
+            <w:tcW w:type="dxa" w:w="1728"/>
           </w:tcPr>
           <w:p>
             <w:r>
@@ -993,7 +2120,7 @@
         </w:tc>
         <w:tc>
           <w:tcPr>
-            <w:tcW w:type="dxa" w:w="2160"/>
+            <w:tcW w:type="dxa" w:w="1728"/>
           </w:tcPr>
           <w:p>
             <w:r>
@@ -1003,7 +2130,7 @@
         </w:tc>
         <w:tc>
           <w:tcPr>
-            <w:tcW w:type="dxa" w:w="2160"/>
+            <w:tcW w:type="dxa" w:w="1728"/>
           </w:tcPr>
           <w:p>
             <w:r>
@@ -1013,11 +2140,21 @@
         </w:tc>
         <w:tc>
           <w:tcPr>
-            <w:tcW w:type="dxa" w:w="2160"/>
+            <w:tcW w:type="dxa" w:w="1728"/>
           </w:tcPr>
           <w:p>
             <w:r>
               <w:t>מטעמי אמא</w:t>
+            </w:r>
+          </w:p>
+        </w:tc>
+        <w:tc>
+          <w:tcPr>
+            <w:tcW w:type="dxa" w:w="1728"/>
+          </w:tcPr>
+          <w:p>
+            <w:r>
+              <w:t>מטבוחה, זאלוק, טקטוקה</w:t>
             </w:r>
           </w:p>
         </w:tc>
@@ -1025,7 +2162,7 @@
       <w:tr>
         <w:tc>
           <w:tcPr>
-            <w:tcW w:type="dxa" w:w="2160"/>
+            <w:tcW w:type="dxa" w:w="1728"/>
           </w:tcPr>
           <w:p>
             <w:r>
@@ -1035,7 +2172,7 @@
         </w:tc>
         <w:tc>
           <w:tcPr>
-            <w:tcW w:type="dxa" w:w="2160"/>
+            <w:tcW w:type="dxa" w:w="1728"/>
           </w:tcPr>
           <w:p>
             <w:r>
@@ -1045,7 +2182,7 @@
         </w:tc>
         <w:tc>
           <w:tcPr>
-            <w:tcW w:type="dxa" w:w="2160"/>
+            <w:tcW w:type="dxa" w:w="1728"/>
           </w:tcPr>
           <w:p>
             <w:r>
@@ -1055,11 +2192,21 @@
         </w:tc>
         <w:tc>
           <w:tcPr>
-            <w:tcW w:type="dxa" w:w="2160"/>
+            <w:tcW w:type="dxa" w:w="1728"/>
           </w:tcPr>
           <w:p>
             <w:r>
               <w:t>מטעמי אמא</w:t>
+            </w:r>
+          </w:p>
+        </w:tc>
+        <w:tc>
+          <w:tcPr>
+            <w:tcW w:type="dxa" w:w="1728"/>
+          </w:tcPr>
+          <w:p>
+            <w:r>
+              <w:t>חצילים, במיה, כרוב</w:t>
             </w:r>
           </w:p>
         </w:tc>
@@ -1067,7 +2214,7 @@
       <w:tr>
         <w:tc>
           <w:tcPr>
-            <w:tcW w:type="dxa" w:w="2160"/>
+            <w:tcW w:type="dxa" w:w="1728"/>
           </w:tcPr>
           <w:p>
             <w:r>
@@ -1077,7 +2224,7 @@
         </w:tc>
         <w:tc>
           <w:tcPr>
-            <w:tcW w:type="dxa" w:w="2160"/>
+            <w:tcW w:type="dxa" w:w="1728"/>
           </w:tcPr>
           <w:p>
             <w:r>
@@ -1087,7 +2234,7 @@
         </w:tc>
         <w:tc>
           <w:tcPr>
-            <w:tcW w:type="dxa" w:w="2160"/>
+            <w:tcW w:type="dxa" w:w="1728"/>
           </w:tcPr>
           <w:p>
             <w:r>
@@ -1097,11 +2244,21 @@
         </w:tc>
         <w:tc>
           <w:tcPr>
-            <w:tcW w:type="dxa" w:w="2160"/>
+            <w:tcW w:type="dxa" w:w="1728"/>
           </w:tcPr>
           <w:p>
             <w:r>
               <w:t>מטעמי אמא</w:t>
+            </w:r>
+          </w:p>
+        </w:tc>
+        <w:tc>
+          <w:tcPr>
+            <w:tcW w:type="dxa" w:w="1728"/>
+          </w:tcPr>
+          <w:p>
+            <w:r>
+              <w:t>טאג׳ין, קפתה, קציצות</w:t>
             </w:r>
           </w:p>
         </w:tc>
@@ -1109,7 +2266,7 @@
       <w:tr>
         <w:tc>
           <w:tcPr>
-            <w:tcW w:type="dxa" w:w="2160"/>
+            <w:tcW w:type="dxa" w:w="1728"/>
           </w:tcPr>
           <w:p>
             <w:r>
@@ -1119,7 +2276,7 @@
         </w:tc>
         <w:tc>
           <w:tcPr>
-            <w:tcW w:type="dxa" w:w="2160"/>
+            <w:tcW w:type="dxa" w:w="1728"/>
           </w:tcPr>
           <w:p>
             <w:r>
@@ -1129,7 +2286,7 @@
         </w:tc>
         <w:tc>
           <w:tcPr>
-            <w:tcW w:type="dxa" w:w="2160"/>
+            <w:tcW w:type="dxa" w:w="1728"/>
           </w:tcPr>
           <w:p>
             <w:r>
@@ -1139,11 +2296,21 @@
         </w:tc>
         <w:tc>
           <w:tcPr>
-            <w:tcW w:type="dxa" w:w="2160"/>
+            <w:tcW w:type="dxa" w:w="1728"/>
           </w:tcPr>
           <w:p>
             <w:r>
               <w:t>מטעמי אמא</w:t>
+            </w:r>
+          </w:p>
+        </w:tc>
+        <w:tc>
+          <w:tcPr>
+            <w:tcW w:type="dxa" w:w="1728"/>
+          </w:tcPr>
+          <w:p>
+            <w:r>
+              <w:t>סנה, פסטייה</w:t>
             </w:r>
           </w:p>
         </w:tc>
@@ -1151,7 +2318,7 @@
       <w:tr>
         <w:tc>
           <w:tcPr>
-            <w:tcW w:type="dxa" w:w="2160"/>
+            <w:tcW w:type="dxa" w:w="1728"/>
           </w:tcPr>
           <w:p>
             <w:r>
@@ -1161,7 +2328,7 @@
         </w:tc>
         <w:tc>
           <w:tcPr>
-            <w:tcW w:type="dxa" w:w="2160"/>
+            <w:tcW w:type="dxa" w:w="1728"/>
           </w:tcPr>
           <w:p>
             <w:r>
@@ -1171,7 +2338,7 @@
         </w:tc>
         <w:tc>
           <w:tcPr>
-            <w:tcW w:type="dxa" w:w="2160"/>
+            <w:tcW w:type="dxa" w:w="1728"/>
           </w:tcPr>
           <w:p>
             <w:r>
@@ -1181,11 +2348,21 @@
         </w:tc>
         <w:tc>
           <w:tcPr>
-            <w:tcW w:type="dxa" w:w="2160"/>
+            <w:tcW w:type="dxa" w:w="1728"/>
           </w:tcPr>
           <w:p>
             <w:r>
               <w:t>מטעמי אמא</w:t>
+            </w:r>
+          </w:p>
+        </w:tc>
+        <w:tc>
+          <w:tcPr>
+            <w:tcW w:type="dxa" w:w="1728"/>
+          </w:tcPr>
+          <w:p>
+            <w:r>
+              <w:t>חרמולה, דג מרוקאי</w:t>
             </w:r>
           </w:p>
         </w:tc>
@@ -1193,7 +2370,7 @@
       <w:tr>
         <w:tc>
           <w:tcPr>
-            <w:tcW w:type="dxa" w:w="2160"/>
+            <w:tcW w:type="dxa" w:w="1728"/>
           </w:tcPr>
           <w:p>
             <w:r>
@@ -1203,7 +2380,7 @@
         </w:tc>
         <w:tc>
           <w:tcPr>
-            <w:tcW w:type="dxa" w:w="2160"/>
+            <w:tcW w:type="dxa" w:w="1728"/>
           </w:tcPr>
           <w:p>
             <w:r>
@@ -1213,7 +2390,7 @@
         </w:tc>
         <w:tc>
           <w:tcPr>
-            <w:tcW w:type="dxa" w:w="2160"/>
+            <w:tcW w:type="dxa" w:w="1728"/>
           </w:tcPr>
           <w:p>
             <w:r>
@@ -1223,11 +2400,21 @@
         </w:tc>
         <w:tc>
           <w:tcPr>
-            <w:tcW w:type="dxa" w:w="2160"/>
+            <w:tcW w:type="dxa" w:w="1728"/>
           </w:tcPr>
           <w:p>
             <w:r>
               <w:t>מטעמי אמא</w:t>
+            </w:r>
+          </w:p>
+        </w:tc>
+        <w:tc>
+          <w:tcPr>
+            <w:tcW w:type="dxa" w:w="1728"/>
+          </w:tcPr>
+          <w:p>
+            <w:r>
+              <w:t>10 תגי חגים</w:t>
             </w:r>
           </w:p>
         </w:tc>
@@ -1235,7 +2422,7 @@
       <w:tr>
         <w:tc>
           <w:tcPr>
-            <w:tcW w:type="dxa" w:w="2160"/>
+            <w:tcW w:type="dxa" w:w="1728"/>
           </w:tcPr>
           <w:p>
             <w:r>
@@ -1245,7 +2432,7 @@
         </w:tc>
         <w:tc>
           <w:tcPr>
-            <w:tcW w:type="dxa" w:w="2160"/>
+            <w:tcW w:type="dxa" w:w="1728"/>
           </w:tcPr>
           <w:p>
             <w:r>
@@ -1255,7 +2442,7 @@
         </w:tc>
         <w:tc>
           <w:tcPr>
-            <w:tcW w:type="dxa" w:w="2160"/>
+            <w:tcW w:type="dxa" w:w="1728"/>
           </w:tcPr>
           <w:p>
             <w:r>
@@ -1265,11 +2452,21 @@
         </w:tc>
         <w:tc>
           <w:tcPr>
-            <w:tcW w:type="dxa" w:w="2160"/>
+            <w:tcW w:type="dxa" w:w="1728"/>
           </w:tcPr>
           <w:p>
             <w:r>
               <w:t>מטעמי אמא</w:t>
+            </w:r>
+          </w:p>
+        </w:tc>
+        <w:tc>
+          <w:tcPr>
+            <w:tcW w:type="dxa" w:w="1728"/>
+          </w:tcPr>
+          <w:p>
+            <w:r>
+              <w:t>מקרוד, שבקיה, ספינג׳</w:t>
             </w:r>
           </w:p>
         </w:tc>
@@ -1277,7 +2474,7 @@
       <w:tr>
         <w:tc>
           <w:tcPr>
-            <w:tcW w:type="dxa" w:w="2160"/>
+            <w:tcW w:type="dxa" w:w="1728"/>
           </w:tcPr>
           <w:p>
             <w:r>
@@ -1287,7 +2484,7 @@
         </w:tc>
         <w:tc>
           <w:tcPr>
-            <w:tcW w:type="dxa" w:w="2160"/>
+            <w:tcW w:type="dxa" w:w="1728"/>
           </w:tcPr>
           <w:p>
             <w:r>
@@ -1297,7 +2494,7 @@
         </w:tc>
         <w:tc>
           <w:tcPr>
-            <w:tcW w:type="dxa" w:w="2160"/>
+            <w:tcW w:type="dxa" w:w="1728"/>
           </w:tcPr>
           <w:p>
             <w:r>
@@ -1307,11 +2504,21 @@
         </w:tc>
         <w:tc>
           <w:tcPr>
-            <w:tcW w:type="dxa" w:w="2160"/>
+            <w:tcW w:type="dxa" w:w="1728"/>
           </w:tcPr>
           <w:p>
             <w:r>
               <w:t>מטעמי אמא</w:t>
+            </w:r>
+          </w:p>
+        </w:tc>
+        <w:tc>
+          <w:tcPr>
+            <w:tcW w:type="dxa" w:w="1728"/>
+          </w:tcPr>
+          <w:p>
+            <w:r>
+              <w:t>8 תתי-קטגוריות</w:t>
             </w:r>
           </w:p>
         </w:tc>
@@ -1319,7 +2526,7 @@
       <w:tr>
         <w:tc>
           <w:tcPr>
-            <w:tcW w:type="dxa" w:w="2160"/>
+            <w:tcW w:type="dxa" w:w="1728"/>
           </w:tcPr>
           <w:p>
             <w:r>
@@ -1329,7 +2536,7 @@
         </w:tc>
         <w:tc>
           <w:tcPr>
-            <w:tcW w:type="dxa" w:w="2160"/>
+            <w:tcW w:type="dxa" w:w="1728"/>
           </w:tcPr>
           <w:p>
             <w:r>
@@ -1339,7 +2546,7 @@
         </w:tc>
         <w:tc>
           <w:tcPr>
-            <w:tcW w:type="dxa" w:w="2160"/>
+            <w:tcW w:type="dxa" w:w="1728"/>
           </w:tcPr>
           <w:p>
             <w:r>
@@ -1349,11 +2556,21 @@
         </w:tc>
         <w:tc>
           <w:tcPr>
-            <w:tcW w:type="dxa" w:w="2160"/>
+            <w:tcW w:type="dxa" w:w="1728"/>
           </w:tcPr>
           <w:p>
             <w:r>
               <w:t>עדות</w:t>
+            </w:r>
+          </w:p>
+        </w:tc>
+        <w:tc>
+          <w:tcPr>
+            <w:tcW w:type="dxa" w:w="1728"/>
+          </w:tcPr>
+          <w:p>
+            <w:r>
+              <w:t>כובה, מסגוף</w:t>
             </w:r>
           </w:p>
         </w:tc>
@@ -1361,7 +2578,7 @@
       <w:tr>
         <w:tc>
           <w:tcPr>
-            <w:tcW w:type="dxa" w:w="2160"/>
+            <w:tcW w:type="dxa" w:w="1728"/>
           </w:tcPr>
           <w:p>
             <w:r>
@@ -1371,7 +2588,7 @@
         </w:tc>
         <w:tc>
           <w:tcPr>
-            <w:tcW w:type="dxa" w:w="2160"/>
+            <w:tcW w:type="dxa" w:w="1728"/>
           </w:tcPr>
           <w:p>
             <w:r>
@@ -1381,7 +2598,7 @@
         </w:tc>
         <w:tc>
           <w:tcPr>
-            <w:tcW w:type="dxa" w:w="2160"/>
+            <w:tcW w:type="dxa" w:w="1728"/>
           </w:tcPr>
           <w:p>
             <w:r>
@@ -1391,11 +2608,21 @@
         </w:tc>
         <w:tc>
           <w:tcPr>
-            <w:tcW w:type="dxa" w:w="2160"/>
+            <w:tcW w:type="dxa" w:w="1728"/>
           </w:tcPr>
           <w:p>
             <w:r>
               <w:t>עדות</w:t>
+            </w:r>
+          </w:p>
+        </w:tc>
+        <w:tc>
+          <w:tcPr>
+            <w:tcW w:type="dxa" w:w="1728"/>
+          </w:tcPr>
+          <w:p>
+            <w:r>
+              <w:t>כובה חמוסטה</w:t>
             </w:r>
           </w:p>
         </w:tc>
@@ -1403,7 +2630,7 @@
       <w:tr>
         <w:tc>
           <w:tcPr>
-            <w:tcW w:type="dxa" w:w="2160"/>
+            <w:tcW w:type="dxa" w:w="1728"/>
           </w:tcPr>
           <w:p>
             <w:r>
@@ -1413,7 +2640,7 @@
         </w:tc>
         <w:tc>
           <w:tcPr>
-            <w:tcW w:type="dxa" w:w="2160"/>
+            <w:tcW w:type="dxa" w:w="1728"/>
           </w:tcPr>
           <w:p>
             <w:r>
@@ -1423,7 +2650,7 @@
         </w:tc>
         <w:tc>
           <w:tcPr>
-            <w:tcW w:type="dxa" w:w="2160"/>
+            <w:tcW w:type="dxa" w:w="1728"/>
           </w:tcPr>
           <w:p>
             <w:r>
@@ -1433,11 +2660,21 @@
         </w:tc>
         <w:tc>
           <w:tcPr>
-            <w:tcW w:type="dxa" w:w="2160"/>
+            <w:tcW w:type="dxa" w:w="1728"/>
           </w:tcPr>
           <w:p>
             <w:r>
               <w:t>עדות</w:t>
+            </w:r>
+          </w:p>
+        </w:tc>
+        <w:tc>
+          <w:tcPr>
+            <w:tcW w:type="dxa" w:w="1728"/>
+          </w:tcPr>
+          <w:p>
+            <w:r>
+              <w:t>חולנט, לביבות</w:t>
             </w:r>
           </w:p>
         </w:tc>
@@ -1445,7 +2682,7 @@
       <w:tr>
         <w:tc>
           <w:tcPr>
-            <w:tcW w:type="dxa" w:w="2160"/>
+            <w:tcW w:type="dxa" w:w="1728"/>
           </w:tcPr>
           <w:p>
             <w:r>
@@ -1455,7 +2692,7 @@
         </w:tc>
         <w:tc>
           <w:tcPr>
-            <w:tcW w:type="dxa" w:w="2160"/>
+            <w:tcW w:type="dxa" w:w="1728"/>
           </w:tcPr>
           <w:p>
             <w:r>
@@ -1465,7 +2702,7 @@
         </w:tc>
         <w:tc>
           <w:tcPr>
-            <w:tcW w:type="dxa" w:w="2160"/>
+            <w:tcW w:type="dxa" w:w="1728"/>
           </w:tcPr>
           <w:p>
             <w:r>
@@ -1475,11 +2712,21 @@
         </w:tc>
         <w:tc>
           <w:tcPr>
-            <w:tcW w:type="dxa" w:w="2160"/>
+            <w:tcW w:type="dxa" w:w="1728"/>
           </w:tcPr>
           <w:p>
             <w:r>
               <w:t>עדות</w:t>
+            </w:r>
+          </w:p>
+        </w:tc>
+        <w:tc>
+          <w:tcPr>
+            <w:tcW w:type="dxa" w:w="1728"/>
+          </w:tcPr>
+          <w:p>
+            <w:r>
+              <w:t>ג'חנון, מלווח, סחוג</w:t>
             </w:r>
           </w:p>
         </w:tc>
@@ -1487,7 +2734,7 @@
       <w:tr>
         <w:tc>
           <w:tcPr>
-            <w:tcW w:type="dxa" w:w="2160"/>
+            <w:tcW w:type="dxa" w:w="1728"/>
           </w:tcPr>
           <w:p>
             <w:r>
@@ -1497,7 +2744,7 @@
         </w:tc>
         <w:tc>
           <w:tcPr>
-            <w:tcW w:type="dxa" w:w="2160"/>
+            <w:tcW w:type="dxa" w:w="1728"/>
           </w:tcPr>
           <w:p>
             <w:r>
@@ -1507,7 +2754,7 @@
         </w:tc>
         <w:tc>
           <w:tcPr>
-            <w:tcW w:type="dxa" w:w="2160"/>
+            <w:tcW w:type="dxa" w:w="1728"/>
           </w:tcPr>
           <w:p>
             <w:r>
@@ -1517,11 +2764,21 @@
         </w:tc>
         <w:tc>
           <w:tcPr>
-            <w:tcW w:type="dxa" w:w="2160"/>
+            <w:tcW w:type="dxa" w:w="1728"/>
           </w:tcPr>
           <w:p>
             <w:r>
               <w:t>עדות</w:t>
+            </w:r>
+          </w:p>
+        </w:tc>
+        <w:tc>
+          <w:tcPr>
+            <w:tcW w:type="dxa" w:w="1728"/>
+          </w:tcPr>
+          <w:p>
+            <w:r>
+              <w:t>תחדיג, גונדי</w:t>
             </w:r>
           </w:p>
         </w:tc>
@@ -1529,7 +2786,7 @@
       <w:tr>
         <w:tc>
           <w:tcPr>
-            <w:tcW w:type="dxa" w:w="2160"/>
+            <w:tcW w:type="dxa" w:w="1728"/>
           </w:tcPr>
           <w:p>
             <w:r>
@@ -1539,7 +2796,7 @@
         </w:tc>
         <w:tc>
           <w:tcPr>
-            <w:tcW w:type="dxa" w:w="2160"/>
+            <w:tcW w:type="dxa" w:w="1728"/>
           </w:tcPr>
           <w:p>
             <w:r>
@@ -1549,7 +2806,7 @@
         </w:tc>
         <w:tc>
           <w:tcPr>
-            <w:tcW w:type="dxa" w:w="2160"/>
+            <w:tcW w:type="dxa" w:w="1728"/>
           </w:tcPr>
           <w:p>
             <w:r>
@@ -1559,11 +2816,21 @@
         </w:tc>
         <w:tc>
           <w:tcPr>
-            <w:tcW w:type="dxa" w:w="2160"/>
+            <w:tcW w:type="dxa" w:w="1728"/>
           </w:tcPr>
           <w:p>
             <w:r>
               <w:t>עדות</w:t>
+            </w:r>
+          </w:p>
+        </w:tc>
+        <w:tc>
+          <w:tcPr>
+            <w:tcW w:type="dxa" w:w="1728"/>
+          </w:tcPr>
+          <w:p>
+            <w:r>
+              <w:t>אוש, סמבוסה</w:t>
             </w:r>
           </w:p>
         </w:tc>
@@ -1571,7 +2838,7 @@
       <w:tr>
         <w:tc>
           <w:tcPr>
-            <w:tcW w:type="dxa" w:w="2160"/>
+            <w:tcW w:type="dxa" w:w="1728"/>
           </w:tcPr>
           <w:p>
             <w:r>
@@ -1581,7 +2848,7 @@
         </w:tc>
         <w:tc>
           <w:tcPr>
-            <w:tcW w:type="dxa" w:w="2160"/>
+            <w:tcW w:type="dxa" w:w="1728"/>
           </w:tcPr>
           <w:p>
             <w:r>
@@ -1591,7 +2858,7 @@
         </w:tc>
         <w:tc>
           <w:tcPr>
-            <w:tcW w:type="dxa" w:w="2160"/>
+            <w:tcW w:type="dxa" w:w="1728"/>
           </w:tcPr>
           <w:p>
             <w:r>
@@ -1601,11 +2868,21 @@
         </w:tc>
         <w:tc>
           <w:tcPr>
-            <w:tcW w:type="dxa" w:w="2160"/>
+            <w:tcW w:type="dxa" w:w="1728"/>
           </w:tcPr>
           <w:p>
             <w:r>
               <w:t>עדות</w:t>
+            </w:r>
+          </w:p>
+        </w:tc>
+        <w:tc>
+          <w:tcPr>
+            <w:tcW w:type="dxa" w:w="1728"/>
+          </w:tcPr>
+          <w:p>
+            <w:r>
+              <w:t>בריק, שקשוקה</w:t>
             </w:r>
           </w:p>
         </w:tc>
@@ -1613,7 +2890,7 @@
       <w:tr>
         <w:tc>
           <w:tcPr>
-            <w:tcW w:type="dxa" w:w="2160"/>
+            <w:tcW w:type="dxa" w:w="1728"/>
           </w:tcPr>
           <w:p>
             <w:r>
@@ -1623,7 +2900,7 @@
         </w:tc>
         <w:tc>
           <w:tcPr>
-            <w:tcW w:type="dxa" w:w="2160"/>
+            <w:tcW w:type="dxa" w:w="1728"/>
           </w:tcPr>
           <w:p>
             <w:r>
@@ -1633,7 +2910,7 @@
         </w:tc>
         <w:tc>
           <w:tcPr>
-            <w:tcW w:type="dxa" w:w="2160"/>
+            <w:tcW w:type="dxa" w:w="1728"/>
           </w:tcPr>
           <w:p>
             <w:r>
@@ -1643,11 +2920,21 @@
         </w:tc>
         <w:tc>
           <w:tcPr>
-            <w:tcW w:type="dxa" w:w="2160"/>
+            <w:tcW w:type="dxa" w:w="1728"/>
           </w:tcPr>
           <w:p>
             <w:r>
               <w:t>עדות</w:t>
+            </w:r>
+          </w:p>
+        </w:tc>
+        <w:tc>
+          <w:tcPr>
+            <w:tcW w:type="dxa" w:w="1728"/>
+          </w:tcPr>
+          <w:p>
+            <w:r>
+              <w:t>בורקס, מנטי</w:t>
             </w:r>
           </w:p>
         </w:tc>
@@ -1655,7 +2942,7 @@
       <w:tr>
         <w:tc>
           <w:tcPr>
-            <w:tcW w:type="dxa" w:w="2160"/>
+            <w:tcW w:type="dxa" w:w="1728"/>
           </w:tcPr>
           <w:p>
             <w:r>
@@ -1665,7 +2952,7 @@
         </w:tc>
         <w:tc>
           <w:tcPr>
-            <w:tcW w:type="dxa" w:w="2160"/>
+            <w:tcW w:type="dxa" w:w="1728"/>
           </w:tcPr>
           <w:p>
             <w:r>
@@ -1675,7 +2962,7 @@
         </w:tc>
         <w:tc>
           <w:tcPr>
-            <w:tcW w:type="dxa" w:w="2160"/>
+            <w:tcW w:type="dxa" w:w="1728"/>
           </w:tcPr>
           <w:p>
             <w:r>
@@ -1685,11 +2972,21 @@
         </w:tc>
         <w:tc>
           <w:tcPr>
-            <w:tcW w:type="dxa" w:w="2160"/>
+            <w:tcW w:type="dxa" w:w="1728"/>
           </w:tcPr>
           <w:p>
             <w:r>
               <w:t>עדות</w:t>
+            </w:r>
+          </w:p>
+        </w:tc>
+        <w:tc>
+          <w:tcPr>
+            <w:tcW w:type="dxa" w:w="1728"/>
+          </w:tcPr>
+          <w:p>
+            <w:r>
+              <w:t>4 תתי-קטגוריות</w:t>
             </w:r>
           </w:p>
         </w:tc>
@@ -1697,7 +2994,7 @@
       <w:tr>
         <w:tc>
           <w:tcPr>
-            <w:tcW w:type="dxa" w:w="2160"/>
+            <w:tcW w:type="dxa" w:w="1728"/>
           </w:tcPr>
           <w:p>
             <w:r>
@@ -1707,7 +3004,7 @@
         </w:tc>
         <w:tc>
           <w:tcPr>
-            <w:tcW w:type="dxa" w:w="2160"/>
+            <w:tcW w:type="dxa" w:w="1728"/>
           </w:tcPr>
           <w:p>
             <w:r>
@@ -1717,7 +3014,7 @@
         </w:tc>
         <w:tc>
           <w:tcPr>
-            <w:tcW w:type="dxa" w:w="2160"/>
+            <w:tcW w:type="dxa" w:w="1728"/>
           </w:tcPr>
           <w:p>
             <w:r>
@@ -1727,11 +3024,21 @@
         </w:tc>
         <w:tc>
           <w:tcPr>
-            <w:tcW w:type="dxa" w:w="2160"/>
+            <w:tcW w:type="dxa" w:w="1728"/>
           </w:tcPr>
           <w:p>
             <w:r>
               <w:t>לא כשרים</w:t>
+            </w:r>
+          </w:p>
+        </w:tc>
+        <w:tc>
+          <w:tcPr>
+            <w:tcW w:type="dxa" w:w="1728"/>
+          </w:tcPr>
+          <w:p>
+            <w:r>
+              <w:t>פירות ים (14), בשר+חלב (26)</w:t>
             </w:r>
           </w:p>
         </w:tc>
@@ -1759,34 +3066,46 @@
         <w:rPr>
           <w:rFonts w:ascii="David" w:hAnsi="David"/>
         </w:rPr>
-        <w:t>מתכון יכול להופיע במספר חגים בו-זמנית. HOLIDAY_TAGS הם רשימות ID.</w:t>
+        <w:t>מתכון יכול להופיע במספר חגים בו-זמנית. HOLIDAY_TAGS הם רשימות ID:</w:t>
       </w:r>
     </w:p>
     <w:tbl>
       <w:tblPr>
         <w:tblStyle w:val="TableGrid"/>
         <w:tblW w:type="auto" w:w="0"/>
+        <w:jc w:val="right"/>
         <w:tblLook w:firstColumn="1" w:firstRow="1" w:lastColumn="0" w:lastRow="0" w:noHBand="0" w:noVBand="1" w:val="04A0"/>
         <w:bidiVisual/>
       </w:tblPr>
       <w:tblGrid>
-        <w:gridCol w:w="4320"/>
-        <w:gridCol w:w="4320"/>
+        <w:gridCol w:w="2880"/>
+        <w:gridCol w:w="2880"/>
+        <w:gridCol w:w="2880"/>
       </w:tblGrid>
       <w:tr>
         <w:tc>
           <w:tcPr>
-            <w:tcW w:type="dxa" w:w="4320"/>
-          </w:tcPr>
-          <w:p>
-            <w:r>
-              <w:t>חג</w:t>
-            </w:r>
-          </w:p>
-        </w:tc>
-        <w:tc>
-          <w:tcPr>
-            <w:tcW w:type="dxa" w:w="4320"/>
+            <w:tcW w:type="dxa" w:w="2880"/>
+          </w:tcPr>
+          <w:p>
+            <w:r>
+              <w:t>מזהה</w:t>
+            </w:r>
+          </w:p>
+        </w:tc>
+        <w:tc>
+          <w:tcPr>
+            <w:tcW w:type="dxa" w:w="2880"/>
+          </w:tcPr>
+          <w:p>
+            <w:r>
+              <w:t>שם החג</w:t>
+            </w:r>
+          </w:p>
+        </w:tc>
+        <w:tc>
+          <w:tcPr>
+            <w:tcW w:type="dxa" w:w="2880"/>
           </w:tcPr>
           <w:p>
             <w:r>
@@ -1798,7 +3117,17 @@
       <w:tr>
         <w:tc>
           <w:tcPr>
-            <w:tcW w:type="dxa" w:w="4320"/>
+            <w:tcW w:type="dxa" w:w="2880"/>
+          </w:tcPr>
+          <w:p>
+            <w:r>
+              <w:t>shabbat</w:t>
+            </w:r>
+          </w:p>
+        </w:tc>
+        <w:tc>
+          <w:tcPr>
+            <w:tcW w:type="dxa" w:w="2880"/>
           </w:tcPr>
           <w:p>
             <w:r>
@@ -1808,7 +3137,7 @@
         </w:tc>
         <w:tc>
           <w:tcPr>
-            <w:tcW w:type="dxa" w:w="4320"/>
+            <w:tcW w:type="dxa" w:w="2880"/>
           </w:tcPr>
           <w:p>
             <w:r>
@@ -1820,7 +3149,17 @@
       <w:tr>
         <w:tc>
           <w:tcPr>
-            <w:tcW w:type="dxa" w:w="4320"/>
+            <w:tcW w:type="dxa" w:w="2880"/>
+          </w:tcPr>
+          <w:p>
+            <w:r>
+              <w:t>rosh</w:t>
+            </w:r>
+          </w:p>
+        </w:tc>
+        <w:tc>
+          <w:tcPr>
+            <w:tcW w:type="dxa" w:w="2880"/>
           </w:tcPr>
           <w:p>
             <w:r>
@@ -1830,7 +3169,7 @@
         </w:tc>
         <w:tc>
           <w:tcPr>
-            <w:tcW w:type="dxa" w:w="4320"/>
+            <w:tcW w:type="dxa" w:w="2880"/>
           </w:tcPr>
           <w:p>
             <w:r>
@@ -1842,7 +3181,17 @@
       <w:tr>
         <w:tc>
           <w:tcPr>
-            <w:tcW w:type="dxa" w:w="4320"/>
+            <w:tcW w:type="dxa" w:w="2880"/>
+          </w:tcPr>
+          <w:p>
+            <w:r>
+              <w:t>kippur</w:t>
+            </w:r>
+          </w:p>
+        </w:tc>
+        <w:tc>
+          <w:tcPr>
+            <w:tcW w:type="dxa" w:w="2880"/>
           </w:tcPr>
           <w:p>
             <w:r>
@@ -1852,7 +3201,7 @@
         </w:tc>
         <w:tc>
           <w:tcPr>
-            <w:tcW w:type="dxa" w:w="4320"/>
+            <w:tcW w:type="dxa" w:w="2880"/>
           </w:tcPr>
           <w:p>
             <w:r>
@@ -1864,7 +3213,17 @@
       <w:tr>
         <w:tc>
           <w:tcPr>
-            <w:tcW w:type="dxa" w:w="4320"/>
+            <w:tcW w:type="dxa" w:w="2880"/>
+          </w:tcPr>
+          <w:p>
+            <w:r>
+              <w:t>pesach</w:t>
+            </w:r>
+          </w:p>
+        </w:tc>
+        <w:tc>
+          <w:tcPr>
+            <w:tcW w:type="dxa" w:w="2880"/>
           </w:tcPr>
           <w:p>
             <w:r>
@@ -1874,7 +3233,7 @@
         </w:tc>
         <w:tc>
           <w:tcPr>
-            <w:tcW w:type="dxa" w:w="4320"/>
+            <w:tcW w:type="dxa" w:w="2880"/>
           </w:tcPr>
           <w:p>
             <w:r>
@@ -1886,7 +3245,17 @@
       <w:tr>
         <w:tc>
           <w:tcPr>
-            <w:tcW w:type="dxa" w:w="4320"/>
+            <w:tcW w:type="dxa" w:w="2880"/>
+          </w:tcPr>
+          <w:p>
+            <w:r>
+              <w:t>mimouna</w:t>
+            </w:r>
+          </w:p>
+        </w:tc>
+        <w:tc>
+          <w:tcPr>
+            <w:tcW w:type="dxa" w:w="2880"/>
           </w:tcPr>
           <w:p>
             <w:r>
@@ -1896,7 +3265,7 @@
         </w:tc>
         <w:tc>
           <w:tcPr>
-            <w:tcW w:type="dxa" w:w="4320"/>
+            <w:tcW w:type="dxa" w:w="2880"/>
           </w:tcPr>
           <w:p>
             <w:r>
@@ -1908,7 +3277,17 @@
       <w:tr>
         <w:tc>
           <w:tcPr>
-            <w:tcW w:type="dxa" w:w="4320"/>
+            <w:tcW w:type="dxa" w:w="2880"/>
+          </w:tcPr>
+          <w:p>
+            <w:r>
+              <w:t>hanukkah</w:t>
+            </w:r>
+          </w:p>
+        </w:tc>
+        <w:tc>
+          <w:tcPr>
+            <w:tcW w:type="dxa" w:w="2880"/>
           </w:tcPr>
           <w:p>
             <w:r>
@@ -1918,7 +3297,7 @@
         </w:tc>
         <w:tc>
           <w:tcPr>
-            <w:tcW w:type="dxa" w:w="4320"/>
+            <w:tcW w:type="dxa" w:w="2880"/>
           </w:tcPr>
           <w:p>
             <w:r>
@@ -1930,7 +3309,17 @@
       <w:tr>
         <w:tc>
           <w:tcPr>
-            <w:tcW w:type="dxa" w:w="4320"/>
+            <w:tcW w:type="dxa" w:w="2880"/>
+          </w:tcPr>
+          <w:p>
+            <w:r>
+              <w:t>purim</w:t>
+            </w:r>
+          </w:p>
+        </w:tc>
+        <w:tc>
+          <w:tcPr>
+            <w:tcW w:type="dxa" w:w="2880"/>
           </w:tcPr>
           <w:p>
             <w:r>
@@ -1940,7 +3329,7 @@
         </w:tc>
         <w:tc>
           <w:tcPr>
-            <w:tcW w:type="dxa" w:w="4320"/>
+            <w:tcW w:type="dxa" w:w="2880"/>
           </w:tcPr>
           <w:p>
             <w:r>
@@ -1952,7 +3341,17 @@
       <w:tr>
         <w:tc>
           <w:tcPr>
-            <w:tcW w:type="dxa" w:w="4320"/>
+            <w:tcW w:type="dxa" w:w="2880"/>
+          </w:tcPr>
+          <w:p>
+            <w:r>
+              <w:t>shavuot</w:t>
+            </w:r>
+          </w:p>
+        </w:tc>
+        <w:tc>
+          <w:tcPr>
+            <w:tcW w:type="dxa" w:w="2880"/>
           </w:tcPr>
           <w:p>
             <w:r>
@@ -1962,7 +3361,7 @@
         </w:tc>
         <w:tc>
           <w:tcPr>
-            <w:tcW w:type="dxa" w:w="4320"/>
+            <w:tcW w:type="dxa" w:w="2880"/>
           </w:tcPr>
           <w:p>
             <w:r>
@@ -1974,7 +3373,17 @@
       <w:tr>
         <w:tc>
           <w:tcPr>
-            <w:tcW w:type="dxa" w:w="4320"/>
+            <w:tcW w:type="dxa" w:w="2880"/>
+          </w:tcPr>
+          <w:p>
+            <w:r>
+              <w:t>sukkot</w:t>
+            </w:r>
+          </w:p>
+        </w:tc>
+        <w:tc>
+          <w:tcPr>
+            <w:tcW w:type="dxa" w:w="2880"/>
           </w:tcPr>
           <w:p>
             <w:r>
@@ -1984,7 +3393,7 @@
         </w:tc>
         <w:tc>
           <w:tcPr>
-            <w:tcW w:type="dxa" w:w="4320"/>
+            <w:tcW w:type="dxa" w:w="2880"/>
           </w:tcPr>
           <w:p>
             <w:r>
@@ -1996,7 +3405,17 @@
       <w:tr>
         <w:tc>
           <w:tcPr>
-            <w:tcW w:type="dxa" w:w="4320"/>
+            <w:tcW w:type="dxa" w:w="2880"/>
+          </w:tcPr>
+          <w:p>
+            <w:r>
+              <w:t>henna</w:t>
+            </w:r>
+          </w:p>
+        </w:tc>
+        <w:tc>
+          <w:tcPr>
+            <w:tcW w:type="dxa" w:w="2880"/>
           </w:tcPr>
           <w:p>
             <w:r>
@@ -2006,7 +3425,7 @@
         </w:tc>
         <w:tc>
           <w:tcPr>
-            <w:tcW w:type="dxa" w:w="4320"/>
+            <w:tcW w:type="dxa" w:w="2880"/>
           </w:tcPr>
           <w:p>
             <w:r>
@@ -2026,7 +3445,20 @@
         <w:rPr>
           <w:rFonts w:ascii="David" w:hAnsi="David"/>
         </w:rPr>
-        <w:t>7. מנגנון תרגום לאנגלית</w:t>
+        <w:t>7. מנגנון תרגום לאנגלית — 3 שכבות</w:t>
+      </w:r>
+    </w:p>
+    <w:p>
+      <w:pPr>
+        <w:jc w:val="right"/>
+        <w:bidi/>
+      </w:pPr>
+      <w:r>
+        <w:rPr>
+          <w:rFonts w:ascii="David" w:hAnsi="David"/>
+          <w:b/>
+        </w:rPr>
+        <w:t>שכבה 1: _TITLE_EN</w:t>
       </w:r>
     </w:p>
     <w:p>
@@ -2038,7 +3470,7 @@
         <w:rPr>
           <w:rFonts w:ascii="David" w:hAnsi="David"/>
         </w:rPr>
-        <w:t>שלוש שכבות:</w:t>
+        <w:t>1,054 כותרות אנגליות. 367 תוקנו לשמות מאכלים מקוריים: Zaalouk, Matbucha, Taktouka, Mofletta, Albondigas, Gazpacho, Sfenj, Kubbeh, Shakshuka, Falafel.</w:t>
       </w:r>
     </w:p>
     <w:p>
@@ -2050,7 +3482,19 @@
         <w:rPr>
           <w:rFonts w:ascii="David" w:hAnsi="David"/>
         </w:rPr>
-        <w:t>1. _TITLE_EN — 1,054 כותרות אנגליות (367 תוקנו לשמות מאכלים מקוריים)</w:t>
+      </w:r>
+    </w:p>
+    <w:p>
+      <w:pPr>
+        <w:jc w:val="right"/>
+        <w:bidi/>
+      </w:pPr>
+      <w:r>
+        <w:rPr>
+          <w:rFonts w:ascii="David" w:hAnsi="David"/>
+          <w:b/>
+        </w:rPr>
+        <w:t>שכבה 2: _PRE_EN (pre_en.js)</w:t>
       </w:r>
     </w:p>
     <w:p>
@@ -2062,7 +3506,7 @@
         <w:rPr>
           <w:rFonts w:ascii="David" w:hAnsi="David"/>
         </w:rPr>
-        <w:t>2. _PRE_EN (pre_en.js) — 1,054 מתכונים × 5 שדות (desc, mem, tip, steps, ingr) — 0 עברית</w:t>
+        <w:t>1,054 מתכונים × 5 שדות: d (desc), m (mem), t (tip), st (steps), ig (ingr). אפס תווי עברית. נבנה אוטומטית מ-_FOOD_DICT.</w:t>
       </w:r>
     </w:p>
     <w:p>
@@ -2074,7 +3518,31 @@
         <w:rPr>
           <w:rFonts w:ascii="David" w:hAnsi="David"/>
         </w:rPr>
-        <w:t>3. _FOOD_DICT — 2,853 ערכי מילון עם morphological matching</w:t>
+      </w:r>
+    </w:p>
+    <w:p>
+      <w:pPr>
+        <w:jc w:val="right"/>
+        <w:bidi/>
+      </w:pPr>
+      <w:r>
+        <w:rPr>
+          <w:rFonts w:ascii="David" w:hAnsi="David"/>
+          <w:b/>
+        </w:rPr>
+        <w:t>שכבה 3: _FOOD_DICT</w:t>
+      </w:r>
+    </w:p>
+    <w:p>
+      <w:pPr>
+        <w:jc w:val="right"/>
+        <w:bidi/>
+      </w:pPr>
+      <w:r>
+        <w:rPr>
+          <w:rFonts w:ascii="David" w:hAnsi="David"/>
+        </w:rPr>
+        <w:t>2,853 ערכי מילון עברית-אנגלית עם morphological matching engine: קידומות (ב/ו/ל/מ/כ/ה), סיומות (ים/ות/ה/ן/ת), שורשים, final forms (נ→ן, מ→ם, צ→ץ).</w:t>
       </w:r>
     </w:p>
     <w:p>
@@ -2087,13 +3555,124 @@
         <w:rPr>
           <w:rFonts w:ascii="David" w:hAnsi="David"/>
         </w:rPr>
-        <w:t>8. פריסה</w:t>
+        <w:t>8. מערכת תמונות</w:t>
+      </w:r>
+    </w:p>
+    <w:p>
+      <w:pPr>
+        <w:jc w:val="right"/>
+        <w:bidi/>
+      </w:pPr>
+      <w:r>
+        <w:rPr>
+          <w:rFonts w:ascii="David" w:hAnsi="David"/>
+          <w:b/>
+        </w:rPr>
+        <w:t>download_images.py:</w:t>
+      </w:r>
+    </w:p>
+    <w:p>
+      <w:pPr>
+        <w:jc w:val="right"/>
+        <w:bidi/>
+      </w:pPr>
+      <w:r>
+        <w:rPr>
+          <w:rFonts w:ascii="David" w:hAnsi="David"/>
+        </w:rPr>
+        <w:t>810 TITLE_QUERIES — מילות חיפוש מותאמות לכל סוג מתכון</w:t>
+      </w:r>
+    </w:p>
+    <w:p>
+      <w:pPr>
+        <w:jc w:val="right"/>
+        <w:bidi/>
+      </w:pPr>
+      <w:r>
+        <w:rPr>
+          <w:rFonts w:ascii="David" w:hAnsi="David"/>
+        </w:rPr>
+        <w:t>build_query(recipe): title match (longest-first) → ingredient fallback → category default</w:t>
+      </w:r>
+    </w:p>
+    <w:p>
+      <w:pPr>
+        <w:jc w:val="right"/>
+        <w:bidi/>
+      </w:pPr>
+      <w:r>
+        <w:rPr>
+          <w:rFonts w:ascii="David" w:hAnsi="David"/>
+        </w:rPr>
+        <w:t>5 מקורות תמונה: Hebrew search, Israeli sites, international, stock, general</w:t>
+      </w:r>
+    </w:p>
+    <w:p>
+      <w:pPr>
+        <w:jc w:val="right"/>
+        <w:bidi/>
+      </w:pPr>
+      <w:r>
+        <w:rPr>
+          <w:rFonts w:ascii="David" w:hAnsi="David"/>
+        </w:rPr>
+        <w:t>_save_with_dedup: SHA256 hash — תמיד כותב קובץ</w:t>
+      </w:r>
+    </w:p>
+    <w:p>
+      <w:pPr>
+        <w:jc w:val="right"/>
+        <w:bidi/>
+      </w:pPr>
+      <w:r>
+        <w:rPr>
+          <w:rFonts w:ascii="David" w:hAnsi="David"/>
+        </w:rPr>
+      </w:r>
+    </w:p>
+    <w:p>
+      <w:pPr>
+        <w:jc w:val="right"/>
+        <w:bidi/>
+      </w:pPr>
+      <w:r>
+        <w:rPr>
+          <w:rFonts w:ascii="David" w:hAnsi="David"/>
+          <w:b/>
+        </w:rPr>
+        <w:t>cleanup_hardlinks.py:</w:t>
+      </w:r>
+    </w:p>
+    <w:p>
+      <w:pPr>
+        <w:jc w:val="right"/>
+        <w:bidi/>
+      </w:pPr>
+      <w:r>
+        <w:rPr>
+          <w:rFonts w:ascii="David" w:hAnsi="David"/>
+        </w:rPr>
+        <w:t>סריקת SHA256 → מחיקת כפילויות → יצירת _IMG_ALIAS.js</w:t>
+      </w:r>
+    </w:p>
+    <w:p>
+      <w:pPr>
+        <w:pStyle w:val="Heading1"/>
+        <w:jc w:val="right"/>
+        <w:bidi/>
+      </w:pPr>
+      <w:r>
+        <w:rPr>
+          <w:rFonts w:ascii="David" w:hAnsi="David"/>
+        </w:rPr>
+        <w:t>9. פריסה ו-GitHub</w:t>
       </w:r>
     </w:p>
     <w:tbl>
       <w:tblPr>
         <w:tblStyle w:val="TableGrid"/>
         <w:tblW w:type="auto" w:w="0"/>
+        <w:jc w:val="right"/>
         <w:tblLook w:firstColumn="1" w:firstRow="1" w:lastColumn="0" w:lastRow="0" w:noHBand="0" w:noVBand="1" w:val="04A0"/>
         <w:bidiVisual/>
       </w:tblPr>
@@ -2207,6 +3786,50 @@
           <w:p>
             <w:r>
               <w:t>main</w:t>
+            </w:r>
+          </w:p>
+        </w:tc>
+      </w:tr>
+      <w:tr>
+        <w:tc>
+          <w:tcPr>
+            <w:tcW w:type="dxa" w:w="4320"/>
+          </w:tcPr>
+          <w:p>
+            <w:r>
+              <w:t>Deployment</w:t>
+            </w:r>
+          </w:p>
+        </w:tc>
+        <w:tc>
+          <w:tcPr>
+            <w:tcW w:type="dxa" w:w="4320"/>
+          </w:tcPr>
+          <w:p>
+            <w:r>
+              <w:t>push ידני</w:t>
+            </w:r>
+          </w:p>
+        </w:tc>
+      </w:tr>
+      <w:tr>
+        <w:tc>
+          <w:tcPr>
+            <w:tcW w:type="dxa" w:w="4320"/>
+          </w:tcPr>
+          <w:p>
+            <w:r>
+              <w:t>Logs</w:t>
+            </w:r>
+          </w:p>
+        </w:tc>
+        <w:tc>
+          <w:tcPr>
+            <w:tcW w:type="dxa" w:w="4320"/>
+          </w:tcPr>
+          <w:p>
+            <w:r>
+              <w:t>logs/download_images_YYYY-MM-DD_HH.MM.log</w:t>
             </w:r>
           </w:p>
         </w:tc>
@@ -2222,13 +3845,14 @@
         <w:rPr>
           <w:rFonts w:ascii="David" w:hAnsi="David"/>
         </w:rPr>
-        <w:t>9. Responsive Design</w:t>
+        <w:t>10. Responsive Design</w:t>
       </w:r>
     </w:p>
     <w:tbl>
       <w:tblPr>
         <w:tblStyle w:val="TableGrid"/>
         <w:tblW w:type="auto" w:w="0"/>
+        <w:jc w:val="right"/>
         <w:tblLook w:firstColumn="1" w:firstRow="1" w:lastColumn="0" w:lastRow="0" w:noHBand="0" w:noVBand="1" w:val="04A0"/>
         <w:bidiVisual/>
       </w:tblPr>
@@ -2275,7 +3899,7 @@
           </w:tcPr>
           <w:p>
             <w:r>
-              <w:t>Grid 4 עמודות, dropdown מלא</w:t>
+              <w:t>Grid 4 עמודות, dropdown מלא, modal side-by-side</w:t>
             </w:r>
           </w:p>
         </w:tc>
@@ -2297,7 +3921,7 @@
           </w:tcPr>
           <w:p>
             <w:r>
-              <w:t>Grid 3 עמודות</w:t>
+              <w:t>Grid 3 עמודות, nav condensed</w:t>
             </w:r>
           </w:p>
         </w:tc>
@@ -2342,6 +3966,186 @@
           <w:p>
             <w:r>
               <w:t>Grid 1 עמודה, modal full screen</w:t>
+            </w:r>
+          </w:p>
+        </w:tc>
+      </w:tr>
+    </w:tbl>
+    <w:p>
+      <w:pPr>
+        <w:pStyle w:val="Heading1"/>
+        <w:jc w:val="right"/>
+        <w:bidi/>
+      </w:pPr>
+      <w:r>
+        <w:rPr>
+          <w:rFonts w:ascii="David" w:hAnsi="David"/>
+        </w:rPr>
+        <w:t>11. נגישות ו-SEO</w:t>
+      </w:r>
+    </w:p>
+    <w:tbl>
+      <w:tblPr>
+        <w:tblStyle w:val="TableGrid"/>
+        <w:tblW w:type="auto" w:w="0"/>
+        <w:jc w:val="right"/>
+        <w:tblLook w:firstColumn="1" w:firstRow="1" w:lastColumn="0" w:lastRow="0" w:noHBand="0" w:noVBand="1" w:val="04A0"/>
+        <w:bidiVisual/>
+      </w:tblPr>
+      <w:tblGrid>
+        <w:gridCol w:w="4320"/>
+        <w:gridCol w:w="4320"/>
+      </w:tblGrid>
+      <w:tr>
+        <w:tc>
+          <w:tcPr>
+            <w:tcW w:type="dxa" w:w="4320"/>
+          </w:tcPr>
+          <w:p>
+            <w:r>
+              <w:t>מאפיין</w:t>
+            </w:r>
+          </w:p>
+        </w:tc>
+        <w:tc>
+          <w:tcPr>
+            <w:tcW w:type="dxa" w:w="4320"/>
+          </w:tcPr>
+          <w:p>
+            <w:r>
+              <w:t>פרטים</w:t>
+            </w:r>
+          </w:p>
+        </w:tc>
+      </w:tr>
+      <w:tr>
+        <w:tc>
+          <w:tcPr>
+            <w:tcW w:type="dxa" w:w="4320"/>
+          </w:tcPr>
+          <w:p>
+            <w:r>
+              <w:t>כיוון שפה</w:t>
+            </w:r>
+          </w:p>
+        </w:tc>
+        <w:tc>
+          <w:tcPr>
+            <w:tcW w:type="dxa" w:w="4320"/>
+          </w:tcPr>
+          <w:p>
+            <w:r>
+              <w:t>dir="rtl" lang="he"</w:t>
+            </w:r>
+          </w:p>
+        </w:tc>
+      </w:tr>
+      <w:tr>
+        <w:tc>
+          <w:tcPr>
+            <w:tcW w:type="dxa" w:w="4320"/>
+          </w:tcPr>
+          <w:p>
+            <w:r>
+              <w:t>Open Graph</w:t>
+            </w:r>
+          </w:p>
+        </w:tc>
+        <w:tc>
+          <w:tcPr>
+            <w:tcW w:type="dxa" w:w="4320"/>
+          </w:tcPr>
+          <w:p>
+            <w:r>
+              <w:t>og:title, og:description, og:image</w:t>
+            </w:r>
+          </w:p>
+        </w:tc>
+      </w:tr>
+      <w:tr>
+        <w:tc>
+          <w:tcPr>
+            <w:tcW w:type="dxa" w:w="4320"/>
+          </w:tcPr>
+          <w:p>
+            <w:r>
+              <w:t>JSON-LD</w:t>
+            </w:r>
+          </w:p>
+        </w:tc>
+        <w:tc>
+          <w:tcPr>
+            <w:tcW w:type="dxa" w:w="4320"/>
+          </w:tcPr>
+          <w:p>
+            <w:r>
+              <w:t>Schema.org WebSite</w:t>
+            </w:r>
+          </w:p>
+        </w:tc>
+      </w:tr>
+      <w:tr>
+        <w:tc>
+          <w:tcPr>
+            <w:tcW w:type="dxa" w:w="4320"/>
+          </w:tcPr>
+          <w:p>
+            <w:r>
+              <w:t>ARIA</w:t>
+            </w:r>
+          </w:p>
+        </w:tc>
+        <w:tc>
+          <w:tcPr>
+            <w:tcW w:type="dxa" w:w="4320"/>
+          </w:tcPr>
+          <w:p>
+            <w:r>
+              <w:t>role, aria-label, aria-expanded, aria-haspopup</w:t>
+            </w:r>
+          </w:p>
+        </w:tc>
+      </w:tr>
+      <w:tr>
+        <w:tc>
+          <w:tcPr>
+            <w:tcW w:type="dxa" w:w="4320"/>
+          </w:tcPr>
+          <w:p>
+            <w:r>
+              <w:t>Keyboard</w:t>
+            </w:r>
+          </w:p>
+        </w:tc>
+        <w:tc>
+          <w:tcPr>
+            <w:tcW w:type="dxa" w:w="4320"/>
+          </w:tcPr>
+          <w:p>
+            <w:r>
+              <w:t>Tab, Enter, Escape — ניווט מלא</w:t>
+            </w:r>
+          </w:p>
+        </w:tc>
+      </w:tr>
+      <w:tr>
+        <w:tc>
+          <w:tcPr>
+            <w:tcW w:type="dxa" w:w="4320"/>
+          </w:tcPr>
+          <w:p>
+            <w:r>
+              <w:t>Lazy loading</w:t>
+            </w:r>
+          </w:p>
+        </w:tc>
+        <w:tc>
+          <w:tcPr>
+            <w:tcW w:type="dxa" w:w="4320"/>
+          </w:tcPr>
+          <w:p>
+            <w:r>
+              <w:t>img.loading=lazy, decoding=async</w:t>
             </w:r>
           </w:p>
         </w:tc>
@@ -2367,7 +4171,7 @@
         <w:rPr>
           <w:rFonts w:ascii="David" w:hAnsi="David"/>
           <w:color w:val="888888"/>
-          <w:sz w:val="20"/>
+          <w:sz w:val="18"/>
         </w:rPr>
         <w:t>ספר הבישול של משפחת בן הראש | קזבלנקה, מרקש, ירושלים | 2026</w:t>
       </w:r>
@@ -2750,7 +4554,7 @@
     </w:pPr>
     <w:rPr>
       <w:rFonts w:ascii="David" w:hAnsi="David"/>
-      <w:sz w:val="24"/>
+      <w:sz w:val="22"/>
     </w:rPr>
   </w:style>
   <w:style w:type="paragraph" w:styleId="Header">

</xml_diff>